<commit_message>
feature(IIQ-AUTH-01): Add backend auth endpoints, axios integration and Register page UI
</commit_message>
<xml_diff>
--- a/docs/InterviewIQ_AgilePlan.docx
+++ b/docs/InterviewIQ_AgilePlan.docx
@@ -1009,7 +1009,7 @@
     </w:p>
     <w:tbl>
       <w:tblPr>
-        <w:tblW w:w="0" w:type="auto"/>
+        <w:tblW w:w="9803" w:type="dxa"/>
         <w:tblCellSpacing w:w="15" w:type="dxa"/>
         <w:tblBorders>
           <w:top w:val="single" w:sz="4" w:space="0" w:color="auto"/>
@@ -1029,9 +1029,10 @@
       </w:tblPr>
       <w:tblGrid>
         <w:gridCol w:w="334"/>
-        <w:gridCol w:w="7663"/>
+        <w:gridCol w:w="7225"/>
         <w:gridCol w:w="900"/>
-        <w:gridCol w:w="453"/>
+        <w:gridCol w:w="438"/>
+        <w:gridCol w:w="906"/>
       </w:tblGrid>
       <w:tr>
         <w:trPr>
@@ -1150,6 +1151,30 @@
             </w:r>
           </w:p>
         </w:tc>
+        <w:tc>
+          <w:tcPr>
+            <w:tcW w:w="0" w:type="auto"/>
+          </w:tcPr>
+          <w:p>
+            <w:pPr>
+              <w:rPr>
+                <w:b/>
+                <w:bCs/>
+                <w:sz w:val="24"/>
+                <w:szCs w:val="24"/>
+                <w:lang w:val="en-IN"/>
+              </w:rPr>
+            </w:pPr>
+            <w:r>
+              <w:rPr>
+                <w:sz w:val="24"/>
+                <w:szCs w:val="24"/>
+                <w:lang w:val="en-IN"/>
+              </w:rPr>
+              <w:t>Time took</w:t>
+            </w:r>
+          </w:p>
+        </w:tc>
       </w:tr>
       <w:tr>
         <w:trPr>
@@ -1269,6 +1294,28 @@
             </w:r>
           </w:p>
         </w:tc>
+        <w:tc>
+          <w:tcPr>
+            <w:tcW w:w="0" w:type="auto"/>
+          </w:tcPr>
+          <w:p>
+            <w:pPr>
+              <w:rPr>
+                <w:sz w:val="24"/>
+                <w:szCs w:val="24"/>
+                <w:lang w:val="en-IN"/>
+              </w:rPr>
+            </w:pPr>
+            <w:r>
+              <w:rPr>
+                <w:sz w:val="24"/>
+                <w:szCs w:val="24"/>
+                <w:lang w:val="en-IN"/>
+              </w:rPr>
+              <w:t>0.5 hr</w:t>
+            </w:r>
+          </w:p>
+        </w:tc>
       </w:tr>
       <w:tr>
         <w:trPr>
@@ -1388,6 +1435,28 @@
             </w:r>
           </w:p>
         </w:tc>
+        <w:tc>
+          <w:tcPr>
+            <w:tcW w:w="0" w:type="auto"/>
+          </w:tcPr>
+          <w:p>
+            <w:pPr>
+              <w:rPr>
+                <w:sz w:val="24"/>
+                <w:szCs w:val="24"/>
+                <w:lang w:val="en-IN"/>
+              </w:rPr>
+            </w:pPr>
+            <w:r>
+              <w:rPr>
+                <w:sz w:val="24"/>
+                <w:szCs w:val="24"/>
+                <w:lang w:val="en-IN"/>
+              </w:rPr>
+              <w:t>10 mins</w:t>
+            </w:r>
+          </w:p>
+        </w:tc>
       </w:tr>
       <w:tr>
         <w:trPr>
@@ -1457,6 +1526,32 @@
               </w:rPr>
               <w:t xml:space="preserve"> for dev/prod profiles</w:t>
             </w:r>
+            <w:r>
+              <w:rPr>
+                <w:sz w:val="24"/>
+                <w:szCs w:val="24"/>
+                <w:lang w:val="en-IN"/>
+              </w:rPr>
+              <w:t xml:space="preserve"> (</w:t>
+            </w:r>
+            <w:proofErr w:type="spellStart"/>
+            <w:r>
+              <w:rPr>
+                <w:sz w:val="24"/>
+                <w:szCs w:val="24"/>
+                <w:lang w:val="en-IN"/>
+              </w:rPr>
+              <w:t>Application.properties</w:t>
+            </w:r>
+            <w:proofErr w:type="spellEnd"/>
+            <w:r>
+              <w:rPr>
+                <w:sz w:val="24"/>
+                <w:szCs w:val="24"/>
+                <w:lang w:val="en-IN"/>
+              </w:rPr>
+              <w:t>)</w:t>
+            </w:r>
           </w:p>
         </w:tc>
         <w:tc>
@@ -1504,6 +1599,28 @@
                 <w:lang w:val="en-IN"/>
               </w:rPr>
               <w:t>1h</w:t>
+            </w:r>
+          </w:p>
+        </w:tc>
+        <w:tc>
+          <w:tcPr>
+            <w:tcW w:w="0" w:type="auto"/>
+          </w:tcPr>
+          <w:p>
+            <w:pPr>
+              <w:rPr>
+                <w:sz w:val="24"/>
+                <w:szCs w:val="24"/>
+                <w:lang w:val="en-IN"/>
+              </w:rPr>
+            </w:pPr>
+            <w:r>
+              <w:rPr>
+                <w:sz w:val="24"/>
+                <w:szCs w:val="24"/>
+                <w:lang w:val="en-IN"/>
+              </w:rPr>
+              <w:t xml:space="preserve"> 1.5 hr</w:t>
             </w:r>
           </w:p>
         </w:tc>
@@ -1618,6 +1735,28 @@
             </w:r>
           </w:p>
         </w:tc>
+        <w:tc>
+          <w:tcPr>
+            <w:tcW w:w="0" w:type="auto"/>
+          </w:tcPr>
+          <w:p>
+            <w:pPr>
+              <w:rPr>
+                <w:sz w:val="24"/>
+                <w:szCs w:val="24"/>
+                <w:lang w:val="en-IN"/>
+              </w:rPr>
+            </w:pPr>
+            <w:r>
+              <w:rPr>
+                <w:sz w:val="24"/>
+                <w:szCs w:val="24"/>
+                <w:lang w:val="en-IN"/>
+              </w:rPr>
+              <w:t>1.5h</w:t>
+            </w:r>
+          </w:p>
+        </w:tc>
       </w:tr>
       <w:tr>
         <w:trPr>
@@ -1720,6 +1859,28 @@
             </w:r>
           </w:p>
         </w:tc>
+        <w:tc>
+          <w:tcPr>
+            <w:tcW w:w="0" w:type="auto"/>
+          </w:tcPr>
+          <w:p>
+            <w:pPr>
+              <w:rPr>
+                <w:sz w:val="24"/>
+                <w:szCs w:val="24"/>
+                <w:lang w:val="en-IN"/>
+              </w:rPr>
+            </w:pPr>
+            <w:r>
+              <w:rPr>
+                <w:sz w:val="24"/>
+                <w:szCs w:val="24"/>
+                <w:lang w:val="en-IN"/>
+              </w:rPr>
+              <w:t xml:space="preserve"> 4h</w:t>
+            </w:r>
+          </w:p>
+        </w:tc>
       </w:tr>
       <w:tr>
         <w:trPr>
@@ -1821,6 +1982,28 @@
             </w:r>
           </w:p>
         </w:tc>
+        <w:tc>
+          <w:tcPr>
+            <w:tcW w:w="0" w:type="auto"/>
+          </w:tcPr>
+          <w:p>
+            <w:pPr>
+              <w:rPr>
+                <w:sz w:val="24"/>
+                <w:szCs w:val="24"/>
+                <w:lang w:val="en-IN"/>
+              </w:rPr>
+            </w:pPr>
+            <w:r>
+              <w:rPr>
+                <w:sz w:val="24"/>
+                <w:szCs w:val="24"/>
+                <w:lang w:val="en-IN"/>
+              </w:rPr>
+              <w:t>1h</w:t>
+            </w:r>
+          </w:p>
+        </w:tc>
       </w:tr>
       <w:tr>
         <w:trPr>
@@ -1940,6 +2123,28 @@
             </w:r>
           </w:p>
         </w:tc>
+        <w:tc>
+          <w:tcPr>
+            <w:tcW w:w="0" w:type="auto"/>
+          </w:tcPr>
+          <w:p>
+            <w:pPr>
+              <w:rPr>
+                <w:sz w:val="24"/>
+                <w:szCs w:val="24"/>
+                <w:lang w:val="en-IN"/>
+              </w:rPr>
+            </w:pPr>
+            <w:r>
+              <w:rPr>
+                <w:sz w:val="24"/>
+                <w:szCs w:val="24"/>
+                <w:lang w:val="en-IN"/>
+              </w:rPr>
+              <w:t>1h</w:t>
+            </w:r>
+          </w:p>
+        </w:tc>
       </w:tr>
     </w:tbl>
     <w:p>
@@ -2158,7 +2363,7 @@
     </w:p>
     <w:tbl>
       <w:tblPr>
-        <w:tblW w:w="0" w:type="auto"/>
+        <w:tblW w:w="9803" w:type="dxa"/>
         <w:tblCellSpacing w:w="15" w:type="dxa"/>
         <w:tblBorders>
           <w:top w:val="single" w:sz="4" w:space="0" w:color="auto"/>
@@ -2178,9 +2383,10 @@
       </w:tblPr>
       <w:tblGrid>
         <w:gridCol w:w="334"/>
-        <w:gridCol w:w="7593"/>
+        <w:gridCol w:w="7230"/>
         <w:gridCol w:w="970"/>
-        <w:gridCol w:w="453"/>
+        <w:gridCol w:w="438"/>
+        <w:gridCol w:w="831"/>
       </w:tblGrid>
       <w:tr>
         <w:trPr>
@@ -2299,6 +2505,30 @@
             </w:r>
           </w:p>
         </w:tc>
+        <w:tc>
+          <w:tcPr>
+            <w:tcW w:w="0" w:type="auto"/>
+          </w:tcPr>
+          <w:p>
+            <w:pPr>
+              <w:rPr>
+                <w:b/>
+                <w:bCs/>
+                <w:sz w:val="24"/>
+                <w:szCs w:val="24"/>
+                <w:lang w:val="en-IN"/>
+              </w:rPr>
+            </w:pPr>
+            <w:r>
+              <w:rPr>
+                <w:sz w:val="24"/>
+                <w:szCs w:val="24"/>
+                <w:lang w:val="en-IN"/>
+              </w:rPr>
+              <w:t>Time took</w:t>
+            </w:r>
+          </w:p>
+        </w:tc>
       </w:tr>
       <w:tr>
         <w:trPr>
@@ -2400,6 +2630,28 @@
             </w:r>
           </w:p>
         </w:tc>
+        <w:tc>
+          <w:tcPr>
+            <w:tcW w:w="0" w:type="auto"/>
+          </w:tcPr>
+          <w:p>
+            <w:pPr>
+              <w:rPr>
+                <w:sz w:val="24"/>
+                <w:szCs w:val="24"/>
+                <w:lang w:val="en-IN"/>
+              </w:rPr>
+            </w:pPr>
+            <w:r>
+              <w:rPr>
+                <w:sz w:val="24"/>
+                <w:szCs w:val="24"/>
+                <w:lang w:val="en-IN"/>
+              </w:rPr>
+              <w:t>1h</w:t>
+            </w:r>
+          </w:p>
+        </w:tc>
       </w:tr>
       <w:tr>
         <w:trPr>
@@ -2501,6 +2753,20 @@
             </w:r>
           </w:p>
         </w:tc>
+        <w:tc>
+          <w:tcPr>
+            <w:tcW w:w="0" w:type="auto"/>
+          </w:tcPr>
+          <w:p>
+            <w:pPr>
+              <w:rPr>
+                <w:sz w:val="24"/>
+                <w:szCs w:val="24"/>
+                <w:lang w:val="en-IN"/>
+              </w:rPr>
+            </w:pPr>
+          </w:p>
+        </w:tc>
       </w:tr>
       <w:tr>
         <w:trPr>
@@ -2602,6 +2868,20 @@
             </w:r>
           </w:p>
         </w:tc>
+        <w:tc>
+          <w:tcPr>
+            <w:tcW w:w="0" w:type="auto"/>
+          </w:tcPr>
+          <w:p>
+            <w:pPr>
+              <w:rPr>
+                <w:sz w:val="24"/>
+                <w:szCs w:val="24"/>
+                <w:lang w:val="en-IN"/>
+              </w:rPr>
+            </w:pPr>
+          </w:p>
+        </w:tc>
       </w:tr>
       <w:tr>
         <w:trPr>
@@ -2757,6 +3037,20 @@
             </w:r>
           </w:p>
         </w:tc>
+        <w:tc>
+          <w:tcPr>
+            <w:tcW w:w="0" w:type="auto"/>
+          </w:tcPr>
+          <w:p>
+            <w:pPr>
+              <w:rPr>
+                <w:sz w:val="24"/>
+                <w:szCs w:val="24"/>
+                <w:lang w:val="en-IN"/>
+              </w:rPr>
+            </w:pPr>
+          </w:p>
+        </w:tc>
       </w:tr>
       <w:tr>
         <w:trPr>
@@ -2858,6 +3152,20 @@
             </w:r>
           </w:p>
         </w:tc>
+        <w:tc>
+          <w:tcPr>
+            <w:tcW w:w="0" w:type="auto"/>
+          </w:tcPr>
+          <w:p>
+            <w:pPr>
+              <w:rPr>
+                <w:sz w:val="24"/>
+                <w:szCs w:val="24"/>
+                <w:lang w:val="en-IN"/>
+              </w:rPr>
+            </w:pPr>
+          </w:p>
+        </w:tc>
       </w:tr>
       <w:tr>
         <w:trPr>
@@ -2977,6 +3285,99 @@
             </w:r>
           </w:p>
         </w:tc>
+        <w:tc>
+          <w:tcPr>
+            <w:tcW w:w="0" w:type="auto"/>
+          </w:tcPr>
+          <w:p>
+            <w:pPr>
+              <w:rPr>
+                <w:sz w:val="24"/>
+                <w:szCs w:val="24"/>
+                <w:lang w:val="en-IN"/>
+              </w:rPr>
+            </w:pPr>
+          </w:p>
+        </w:tc>
+      </w:tr>
+      <w:tr>
+        <w:trPr>
+          <w:tblCellSpacing w:w="15" w:type="dxa"/>
+        </w:trPr>
+        <w:tc>
+          <w:tcPr>
+            <w:tcW w:w="0" w:type="auto"/>
+            <w:vAlign w:val="center"/>
+          </w:tcPr>
+          <w:p>
+            <w:pPr>
+              <w:rPr>
+                <w:sz w:val="24"/>
+                <w:szCs w:val="24"/>
+                <w:lang w:val="en-IN"/>
+              </w:rPr>
+            </w:pPr>
+          </w:p>
+        </w:tc>
+        <w:tc>
+          <w:tcPr>
+            <w:tcW w:w="0" w:type="auto"/>
+            <w:vAlign w:val="center"/>
+          </w:tcPr>
+          <w:p>
+            <w:pPr>
+              <w:rPr>
+                <w:sz w:val="24"/>
+                <w:szCs w:val="24"/>
+                <w:lang w:val="en-IN"/>
+              </w:rPr>
+            </w:pPr>
+          </w:p>
+        </w:tc>
+        <w:tc>
+          <w:tcPr>
+            <w:tcW w:w="0" w:type="auto"/>
+            <w:vAlign w:val="center"/>
+          </w:tcPr>
+          <w:p>
+            <w:pPr>
+              <w:rPr>
+                <w:sz w:val="24"/>
+                <w:szCs w:val="24"/>
+                <w:lang w:val="en-IN"/>
+              </w:rPr>
+            </w:pPr>
+          </w:p>
+        </w:tc>
+        <w:tc>
+          <w:tcPr>
+            <w:tcW w:w="0" w:type="auto"/>
+            <w:vAlign w:val="center"/>
+          </w:tcPr>
+          <w:p>
+            <w:pPr>
+              <w:rPr>
+                <w:sz w:val="24"/>
+                <w:szCs w:val="24"/>
+                <w:lang w:val="en-IN"/>
+              </w:rPr>
+            </w:pPr>
+          </w:p>
+        </w:tc>
+        <w:tc>
+          <w:tcPr>
+            <w:tcW w:w="0" w:type="auto"/>
+          </w:tcPr>
+          <w:p>
+            <w:pPr>
+              <w:rPr>
+                <w:sz w:val="24"/>
+                <w:szCs w:val="24"/>
+                <w:lang w:val="en-IN"/>
+              </w:rPr>
+            </w:pPr>
+          </w:p>
+        </w:tc>
       </w:tr>
     </w:tbl>
     <w:p>
@@ -3087,7 +3488,16 @@
           <w:szCs w:val="24"/>
           <w:lang w:val="en-IN"/>
         </w:rPr>
-        <w:t xml:space="preserve"> containerize the application using Docker and set up a basic CI/CD pipeline,</w:t>
+        <w:t xml:space="preserve"> containerize the application using Docker and set up a basic CI/CD </w:t>
+      </w:r>
+      <w:r>
+        <w:rPr>
+          <w:sz w:val="24"/>
+          <w:szCs w:val="24"/>
+          <w:lang w:val="en-IN"/>
+        </w:rPr>
+        <w:lastRenderedPageBreak/>
+        <w:t>pipeline,</w:t>
       </w:r>
       <w:r>
         <w:rPr>
@@ -3176,7 +3586,7 @@
     </w:p>
     <w:tbl>
       <w:tblPr>
-        <w:tblW w:w="0" w:type="auto"/>
+        <w:tblW w:w="9803" w:type="dxa"/>
         <w:tblCellSpacing w:w="15" w:type="dxa"/>
         <w:tblBorders>
           <w:top w:val="single" w:sz="4" w:space="0" w:color="auto"/>
@@ -3196,9 +3606,10 @@
       </w:tblPr>
       <w:tblGrid>
         <w:gridCol w:w="334"/>
-        <w:gridCol w:w="7731"/>
+        <w:gridCol w:w="7179"/>
         <w:gridCol w:w="832"/>
-        <w:gridCol w:w="453"/>
+        <w:gridCol w:w="438"/>
+        <w:gridCol w:w="1020"/>
       </w:tblGrid>
       <w:tr>
         <w:trPr>
@@ -3229,7 +3640,6 @@
                 <w:szCs w:val="24"/>
                 <w:lang w:val="en-IN"/>
               </w:rPr>
-              <w:lastRenderedPageBreak/>
               <w:t>#</w:t>
             </w:r>
           </w:p>
@@ -3315,6 +3725,30 @@
                 <w:lang w:val="en-IN"/>
               </w:rPr>
               <w:t>Est.</w:t>
+            </w:r>
+          </w:p>
+        </w:tc>
+        <w:tc>
+          <w:tcPr>
+            <w:tcW w:w="0" w:type="auto"/>
+          </w:tcPr>
+          <w:p>
+            <w:pPr>
+              <w:rPr>
+                <w:b/>
+                <w:bCs/>
+                <w:sz w:val="24"/>
+                <w:szCs w:val="24"/>
+                <w:lang w:val="en-IN"/>
+              </w:rPr>
+            </w:pPr>
+            <w:r>
+              <w:rPr>
+                <w:sz w:val="24"/>
+                <w:szCs w:val="24"/>
+                <w:lang w:val="en-IN"/>
+              </w:rPr>
+              <w:t>Time took</w:t>
             </w:r>
           </w:p>
         </w:tc>
@@ -3437,6 +3871,20 @@
             </w:r>
           </w:p>
         </w:tc>
+        <w:tc>
+          <w:tcPr>
+            <w:tcW w:w="0" w:type="auto"/>
+          </w:tcPr>
+          <w:p>
+            <w:pPr>
+              <w:rPr>
+                <w:sz w:val="24"/>
+                <w:szCs w:val="24"/>
+                <w:lang w:val="en-IN"/>
+              </w:rPr>
+            </w:pPr>
+          </w:p>
+        </w:tc>
       </w:tr>
       <w:tr>
         <w:trPr>
@@ -3556,6 +4004,20 @@
             </w:r>
           </w:p>
         </w:tc>
+        <w:tc>
+          <w:tcPr>
+            <w:tcW w:w="0" w:type="auto"/>
+          </w:tcPr>
+          <w:p>
+            <w:pPr>
+              <w:rPr>
+                <w:sz w:val="24"/>
+                <w:szCs w:val="24"/>
+                <w:lang w:val="en-IN"/>
+              </w:rPr>
+            </w:pPr>
+          </w:p>
+        </w:tc>
       </w:tr>
       <w:tr>
         <w:trPr>
@@ -3685,6 +4147,20 @@
             </w:r>
           </w:p>
         </w:tc>
+        <w:tc>
+          <w:tcPr>
+            <w:tcW w:w="0" w:type="auto"/>
+          </w:tcPr>
+          <w:p>
+            <w:pPr>
+              <w:rPr>
+                <w:sz w:val="24"/>
+                <w:szCs w:val="24"/>
+                <w:lang w:val="en-IN"/>
+              </w:rPr>
+            </w:pPr>
+          </w:p>
+        </w:tc>
       </w:tr>
       <w:tr>
         <w:trPr>
@@ -3786,6 +4262,28 @@
             </w:r>
           </w:p>
         </w:tc>
+        <w:tc>
+          <w:tcPr>
+            <w:tcW w:w="0" w:type="auto"/>
+          </w:tcPr>
+          <w:p>
+            <w:pPr>
+              <w:rPr>
+                <w:sz w:val="24"/>
+                <w:szCs w:val="24"/>
+                <w:lang w:val="en-IN"/>
+              </w:rPr>
+            </w:pPr>
+            <w:r>
+              <w:rPr>
+                <w:sz w:val="24"/>
+                <w:szCs w:val="24"/>
+                <w:lang w:val="en-IN"/>
+              </w:rPr>
+              <w:t>1.5hr</w:t>
+            </w:r>
+          </w:p>
+        </w:tc>
       </w:tr>
       <w:tr>
         <w:trPr>
@@ -3885,6 +4383,20 @@
               </w:rPr>
               <w:t>3h</w:t>
             </w:r>
+          </w:p>
+        </w:tc>
+        <w:tc>
+          <w:tcPr>
+            <w:tcW w:w="0" w:type="auto"/>
+          </w:tcPr>
+          <w:p>
+            <w:pPr>
+              <w:rPr>
+                <w:sz w:val="24"/>
+                <w:szCs w:val="24"/>
+                <w:lang w:val="en-IN"/>
+              </w:rPr>
+            </w:pPr>
           </w:p>
         </w:tc>
       </w:tr>
@@ -4606,6 +5118,14 @@
                 <w:lang w:val="en-IN"/>
               </w:rPr>
             </w:pPr>
+            <w:r>
+              <w:rPr>
+                <w:sz w:val="24"/>
+                <w:szCs w:val="24"/>
+                <w:lang w:val="en-IN"/>
+              </w:rPr>
+              <w:t>2h</w:t>
+            </w:r>
           </w:p>
         </w:tc>
       </w:tr>
@@ -4739,6 +5259,14 @@
                 <w:lang w:val="en-IN"/>
               </w:rPr>
             </w:pPr>
+            <w:r>
+              <w:rPr>
+                <w:sz w:val="24"/>
+                <w:szCs w:val="24"/>
+                <w:lang w:val="en-IN"/>
+              </w:rPr>
+              <w:t>10 mins</w:t>
+            </w:r>
           </w:p>
         </w:tc>
       </w:tr>
@@ -4766,6 +5294,7 @@
                 <w:szCs w:val="24"/>
                 <w:lang w:val="en-IN"/>
               </w:rPr>
+              <w:lastRenderedPageBreak/>
               <w:t>T3</w:t>
             </w:r>
           </w:p>
@@ -5005,6 +5534,14 @@
                 <w:lang w:val="en-IN"/>
               </w:rPr>
             </w:pPr>
+            <w:r>
+              <w:rPr>
+                <w:sz w:val="24"/>
+                <w:szCs w:val="24"/>
+                <w:lang w:val="en-IN"/>
+              </w:rPr>
+              <w:t>45 mins</w:t>
+            </w:r>
           </w:p>
         </w:tc>
       </w:tr>
@@ -5147,7 +5684,6 @@
                 <w:szCs w:val="24"/>
                 <w:lang w:val="en-IN"/>
               </w:rPr>
-              <w:lastRenderedPageBreak/>
               <w:t>T6</w:t>
             </w:r>
           </w:p>
@@ -6683,6 +7219,17 @@
           <w:szCs w:val="24"/>
           <w:lang w:val="en-IN"/>
         </w:rPr>
+        <w:br/>
+      </w:r>
+      <w:r>
+        <w:rPr>
+          <w:b/>
+          <w:bCs/>
+          <w:sz w:val="24"/>
+          <w:szCs w:val="24"/>
+          <w:lang w:val="en-IN"/>
+        </w:rPr>
+        <w:lastRenderedPageBreak/>
         <w:t xml:space="preserve">User Story: </w:t>
       </w:r>
       <w:r>
@@ -6783,28 +7330,6 @@
           <w:szCs w:val="24"/>
           <w:lang w:val="en-IN"/>
         </w:rPr>
-        <w:br/>
-      </w:r>
-    </w:p>
-    <w:p>
-      <w:pPr>
-        <w:rPr>
-          <w:b/>
-          <w:bCs/>
-          <w:sz w:val="24"/>
-          <w:szCs w:val="24"/>
-          <w:lang w:val="en-IN"/>
-        </w:rPr>
-      </w:pPr>
-      <w:r>
-        <w:rPr>
-          <w:b/>
-          <w:bCs/>
-          <w:sz w:val="24"/>
-          <w:szCs w:val="24"/>
-          <w:lang w:val="en-IN"/>
-        </w:rPr>
-        <w:lastRenderedPageBreak/>
         <w:br/>
       </w:r>
       <w:r>
@@ -8333,6 +8858,7 @@
                 <w:szCs w:val="24"/>
                 <w:lang w:val="en-IN"/>
               </w:rPr>
+              <w:lastRenderedPageBreak/>
               <w:t>T2</w:t>
             </w:r>
           </w:p>
@@ -8466,7 +8992,6 @@
                 <w:szCs w:val="24"/>
                 <w:lang w:val="en-IN"/>
               </w:rPr>
-              <w:lastRenderedPageBreak/>
               <w:t>T3</w:t>
             </w:r>
           </w:p>
@@ -10059,6 +10584,17 @@
           <w:szCs w:val="24"/>
           <w:lang w:val="en-IN"/>
         </w:rPr>
+        <w:br/>
+      </w:r>
+      <w:r>
+        <w:rPr>
+          <w:b/>
+          <w:bCs/>
+          <w:sz w:val="24"/>
+          <w:szCs w:val="24"/>
+          <w:lang w:val="en-IN"/>
+        </w:rPr>
+        <w:lastRenderedPageBreak/>
         <w:t xml:space="preserve">User Story: </w:t>
       </w:r>
       <w:r>
@@ -10171,27 +10707,12 @@
         </w:rPr>
         <w:t xml:space="preserve"> 3 Days</w:t>
       </w:r>
-    </w:p>
-    <w:p>
-      <w:pPr>
-        <w:rPr>
-          <w:b/>
-          <w:bCs/>
-          <w:sz w:val="24"/>
-          <w:szCs w:val="24"/>
-          <w:lang w:val="en-IN"/>
-        </w:rPr>
-      </w:pPr>
-      <w:r>
-        <w:rPr>
-          <w:rFonts w:ascii="Segoe UI Emoji" w:hAnsi="Segoe UI Emoji" w:cs="Segoe UI Emoji"/>
-          <w:b/>
-          <w:bCs/>
-          <w:sz w:val="24"/>
-          <w:szCs w:val="24"/>
-          <w:lang w:val="en-IN"/>
-        </w:rPr>
-        <w:lastRenderedPageBreak/>
+      <w:r>
+        <w:rPr>
+          <w:sz w:val="24"/>
+          <w:szCs w:val="24"/>
+          <w:lang w:val="en-IN"/>
+        </w:rPr>
         <w:br/>
       </w:r>
       <w:r>
@@ -11067,22 +11588,21 @@
     <w:p>
       <w:pPr>
         <w:rPr>
-          <w:b/>
-          <w:bCs/>
           <w:sz w:val="24"/>
           <w:szCs w:val="24"/>
           <w:lang w:val="en-IN"/>
         </w:rPr>
       </w:pPr>
-    </w:p>
-    <w:p>
-      <w:pPr>
-        <w:rPr>
-          <w:sz w:val="24"/>
-          <w:szCs w:val="24"/>
-          <w:lang w:val="en-IN"/>
-        </w:rPr>
-      </w:pPr>
+      <w:r>
+        <w:rPr>
+          <w:b/>
+          <w:bCs/>
+          <w:sz w:val="24"/>
+          <w:szCs w:val="24"/>
+          <w:lang w:val="en-IN"/>
+        </w:rPr>
+        <w:br/>
+      </w:r>
       <w:r>
         <w:rPr>
           <w:b/>
@@ -11167,17 +11687,14 @@
         </w:rPr>
         <w:t xml:space="preserve"> 2 Days</w:t>
       </w:r>
-    </w:p>
-    <w:p>
-      <w:pPr>
-        <w:rPr>
-          <w:b/>
-          <w:bCs/>
-          <w:sz w:val="24"/>
-          <w:szCs w:val="24"/>
-          <w:lang w:val="en-IN"/>
-        </w:rPr>
-      </w:pPr>
+      <w:r>
+        <w:rPr>
+          <w:sz w:val="24"/>
+          <w:szCs w:val="24"/>
+          <w:lang w:val="en-IN"/>
+        </w:rPr>
+        <w:br/>
+      </w:r>
       <w:r>
         <w:rPr>
           <w:b/>
@@ -11766,17 +12283,6 @@
           <w:lang w:val="en-IN"/>
         </w:rPr>
       </w:pPr>
-    </w:p>
-    <w:p>
-      <w:pPr>
-        <w:rPr>
-          <w:b/>
-          <w:bCs/>
-          <w:sz w:val="24"/>
-          <w:szCs w:val="24"/>
-          <w:lang w:val="en-IN"/>
-        </w:rPr>
-      </w:pPr>
       <w:r>
         <w:rPr>
           <w:b/>
@@ -14929,25 +15435,18 @@
         <w:rPr>
           <w:sz w:val="24"/>
           <w:szCs w:val="24"/>
+          <w:lang w:val="en-IN"/>
         </w:rPr>
       </w:pPr>
-    </w:p>
-    <w:p>
-      <w:pPr>
-        <w:rPr>
-          <w:sz w:val="24"/>
-          <w:szCs w:val="24"/>
-          <w:lang w:val="en-IN"/>
-        </w:rPr>
-      </w:pPr>
-      <w:r>
-        <w:rPr>
-          <w:b/>
-          <w:bCs/>
-          <w:sz w:val="24"/>
-          <w:szCs w:val="24"/>
-          <w:lang w:val="en-IN"/>
-        </w:rPr>
+      <w:r>
+        <w:rPr>
+          <w:b/>
+          <w:bCs/>
+          <w:sz w:val="24"/>
+          <w:szCs w:val="24"/>
+          <w:lang w:val="en-IN"/>
+        </w:rPr>
+        <w:lastRenderedPageBreak/>
         <w:t xml:space="preserve">User Story: </w:t>
       </w:r>
       <w:r>
@@ -15906,60 +16405,6 @@
         </w:rPr>
         <w:br/>
       </w:r>
-    </w:p>
-    <w:p>
-      <w:pPr>
-        <w:rPr>
-          <w:b/>
-          <w:bCs/>
-          <w:sz w:val="24"/>
-          <w:szCs w:val="24"/>
-          <w:lang w:val="en-IN"/>
-        </w:rPr>
-      </w:pPr>
-    </w:p>
-    <w:p>
-      <w:pPr>
-        <w:rPr>
-          <w:b/>
-          <w:bCs/>
-          <w:sz w:val="24"/>
-          <w:szCs w:val="24"/>
-          <w:lang w:val="en-IN"/>
-        </w:rPr>
-      </w:pPr>
-    </w:p>
-    <w:p>
-      <w:pPr>
-        <w:rPr>
-          <w:b/>
-          <w:bCs/>
-          <w:sz w:val="24"/>
-          <w:szCs w:val="24"/>
-          <w:lang w:val="en-IN"/>
-        </w:rPr>
-      </w:pPr>
-      <w:r>
-        <w:rPr>
-          <w:b/>
-          <w:bCs/>
-          <w:sz w:val="24"/>
-          <w:szCs w:val="24"/>
-          <w:lang w:val="en-IN"/>
-        </w:rPr>
-        <w:lastRenderedPageBreak/>
-        <w:br/>
-      </w:r>
-      <w:r>
-        <w:rPr>
-          <w:b/>
-          <w:bCs/>
-          <w:sz w:val="24"/>
-          <w:szCs w:val="24"/>
-          <w:lang w:val="en-IN"/>
-        </w:rPr>
-        <w:br/>
-      </w:r>
       <w:r>
         <w:rPr>
           <w:b/>
@@ -16412,6 +16857,7 @@
                 <w:szCs w:val="24"/>
                 <w:lang w:val="en-IN"/>
               </w:rPr>
+              <w:lastRenderedPageBreak/>
               <w:t>T2</w:t>
             </w:r>
           </w:p>
@@ -17796,7 +18242,6 @@
                 <w:szCs w:val="24"/>
                 <w:lang w:val="en-IN"/>
               </w:rPr>
-              <w:lastRenderedPageBreak/>
               <w:t>T4</w:t>
             </w:r>
           </w:p>
@@ -18009,6 +18454,17 @@
           <w:szCs w:val="24"/>
           <w:lang w:val="en-IN"/>
         </w:rPr>
+        <w:lastRenderedPageBreak/>
+        <w:br/>
+      </w:r>
+      <w:r>
+        <w:rPr>
+          <w:b/>
+          <w:bCs/>
+          <w:sz w:val="24"/>
+          <w:szCs w:val="24"/>
+          <w:lang w:val="en-IN"/>
+        </w:rPr>
         <w:t xml:space="preserve">FEATURE </w:t>
       </w:r>
       <w:r>
@@ -18212,47 +18668,7 @@
           <w:szCs w:val="24"/>
           <w:lang w:val="en-IN"/>
         </w:rPr>
-        <w:t>As a Candidate,</w:t>
-      </w:r>
-      <w:r>
-        <w:rPr>
-          <w:sz w:val="24"/>
-          <w:szCs w:val="24"/>
-          <w:lang w:val="en-IN"/>
-        </w:rPr>
-        <w:t xml:space="preserve"> </w:t>
-      </w:r>
-      <w:r>
-        <w:rPr>
-          <w:sz w:val="24"/>
-          <w:szCs w:val="24"/>
-          <w:lang w:val="en-IN"/>
-        </w:rPr>
-        <w:t>I want to see a dashboard showing my weak areas (e.g., DSA, System Design)</w:t>
-      </w:r>
-      <w:r>
-        <w:rPr>
-          <w:sz w:val="24"/>
-          <w:szCs w:val="24"/>
-          <w:lang w:val="en-IN"/>
-        </w:rPr>
-        <w:t xml:space="preserve"> </w:t>
-      </w:r>
-      <w:r>
-        <w:rPr>
-          <w:sz w:val="24"/>
-          <w:szCs w:val="24"/>
-          <w:lang w:val="en-IN"/>
-        </w:rPr>
-        <w:t>based on feedback scores,</w:t>
-      </w:r>
-      <w:r>
-        <w:rPr>
-          <w:sz w:val="24"/>
-          <w:szCs w:val="24"/>
-          <w:lang w:val="en-IN"/>
-        </w:rPr>
-        <w:t xml:space="preserve"> </w:t>
+        <w:t xml:space="preserve">As a Candidate, I want to see a dashboard showing my weak areas (e.g., DSA, System Design) based on feedback scores, </w:t>
       </w:r>
       <w:proofErr w:type="gramStart"/>
       <w:r>
@@ -19142,24 +19558,7 @@
           <w:szCs w:val="24"/>
           <w:lang w:val="en-IN"/>
         </w:rPr>
-        <w:lastRenderedPageBreak/>
-        <w:t>As a Candidate,</w:t>
-      </w:r>
-      <w:r>
-        <w:rPr>
-          <w:sz w:val="24"/>
-          <w:szCs w:val="24"/>
-          <w:lang w:val="en-IN"/>
-        </w:rPr>
-        <w:t xml:space="preserve"> </w:t>
-      </w:r>
-      <w:r>
-        <w:rPr>
-          <w:sz w:val="24"/>
-          <w:szCs w:val="24"/>
-          <w:lang w:val="en-IN"/>
-        </w:rPr>
-        <w:t>I want to see my interview success rate (offers/total applications),</w:t>
+        <w:t>As a Candidate, I want to see my interview success rate (offers/total applications),</w:t>
       </w:r>
       <w:r>
         <w:rPr>
@@ -19196,17 +19595,14 @@
         </w:rPr>
         <w:t xml:space="preserve"> 2 Days</w:t>
       </w:r>
-    </w:p>
-    <w:p>
-      <w:pPr>
-        <w:rPr>
-          <w:b/>
-          <w:bCs/>
-          <w:sz w:val="24"/>
-          <w:szCs w:val="24"/>
-          <w:lang w:val="en-IN"/>
-        </w:rPr>
-      </w:pPr>
+      <w:r>
+        <w:rPr>
+          <w:sz w:val="24"/>
+          <w:szCs w:val="24"/>
+          <w:lang w:val="en-IN"/>
+        </w:rPr>
+        <w:br/>
+      </w:r>
       <w:r>
         <w:rPr>
           <w:b/>
@@ -19273,6 +19669,7 @@
                 <w:szCs w:val="24"/>
                 <w:lang w:val="en-IN"/>
               </w:rPr>
+              <w:lastRenderedPageBreak/>
               <w:t>#</w:t>
             </w:r>
           </w:p>
@@ -19874,39 +20271,7 @@
           <w:szCs w:val="24"/>
           <w:lang w:val="en-IN"/>
         </w:rPr>
-        <w:t>As a Candidate,</w:t>
-      </w:r>
-      <w:r>
-        <w:rPr>
-          <w:sz w:val="24"/>
-          <w:szCs w:val="24"/>
-          <w:lang w:val="en-IN"/>
-        </w:rPr>
-        <w:t xml:space="preserve"> </w:t>
-      </w:r>
-      <w:r>
-        <w:rPr>
-          <w:sz w:val="24"/>
-          <w:szCs w:val="24"/>
-          <w:lang w:val="en-IN"/>
-        </w:rPr>
-        <w:t>I want to see the most common rejection stage (e.g., Technical Round, System Design),</w:t>
-      </w:r>
-      <w:r>
-        <w:rPr>
-          <w:sz w:val="24"/>
-          <w:szCs w:val="24"/>
-          <w:lang w:val="en-IN"/>
-        </w:rPr>
-        <w:t xml:space="preserve"> </w:t>
-      </w:r>
-      <w:r>
-        <w:rPr>
-          <w:sz w:val="24"/>
-          <w:szCs w:val="24"/>
-          <w:lang w:val="en-IN"/>
-        </w:rPr>
-        <w:t>So that I can understand where I'm struggling most.</w:t>
+        <w:t>As a Candidate, I want to see the most common rejection stage (e.g., Technical Round, System Design), So that I can understand where I'm struggling most.</w:t>
       </w:r>
       <w:r>
         <w:rPr>
@@ -20614,39 +20979,7 @@
           <w:szCs w:val="24"/>
           <w:lang w:val="en-IN"/>
         </w:rPr>
-        <w:t>As a Candidate,</w:t>
-      </w:r>
-      <w:r>
-        <w:rPr>
-          <w:sz w:val="24"/>
-          <w:szCs w:val="24"/>
-          <w:lang w:val="en-IN"/>
-        </w:rPr>
-        <w:t xml:space="preserve"> </w:t>
-      </w:r>
-      <w:r>
-        <w:rPr>
-          <w:sz w:val="24"/>
-          <w:szCs w:val="24"/>
-          <w:lang w:val="en-IN"/>
-        </w:rPr>
-        <w:t>I want to see my performance trends over time (last 6 months),</w:t>
-      </w:r>
-      <w:r>
-        <w:rPr>
-          <w:sz w:val="24"/>
-          <w:szCs w:val="24"/>
-          <w:lang w:val="en-IN"/>
-        </w:rPr>
-        <w:t xml:space="preserve"> </w:t>
-      </w:r>
-      <w:r>
-        <w:rPr>
-          <w:sz w:val="24"/>
-          <w:szCs w:val="24"/>
-          <w:lang w:val="en-IN"/>
-        </w:rPr>
-        <w:t>So that I can track whether I'm improving.</w:t>
+        <w:t>As a Candidate, I want to see my performance trends over time (last 6 months), So that I can track whether I'm improving.</w:t>
       </w:r>
       <w:r>
         <w:rPr>
@@ -21551,39 +21884,7 @@
           <w:szCs w:val="24"/>
           <w:lang w:val="en-IN"/>
         </w:rPr>
-        <w:t>As a Candidate,</w:t>
-      </w:r>
-      <w:r>
-        <w:rPr>
-          <w:sz w:val="24"/>
-          <w:szCs w:val="24"/>
-          <w:lang w:val="en-IN"/>
-        </w:rPr>
-        <w:t xml:space="preserve"> </w:t>
-      </w:r>
-      <w:r>
-        <w:rPr>
-          <w:sz w:val="24"/>
-          <w:szCs w:val="24"/>
-          <w:lang w:val="en-IN"/>
-        </w:rPr>
-        <w:t>I want to receive smart recommendations (e.g., "Practice System Design") when I have weak areas,</w:t>
-      </w:r>
-      <w:r>
-        <w:rPr>
-          <w:sz w:val="24"/>
-          <w:szCs w:val="24"/>
-          <w:lang w:val="en-IN"/>
-        </w:rPr>
-        <w:t xml:space="preserve"> </w:t>
-      </w:r>
-      <w:r>
-        <w:rPr>
-          <w:sz w:val="24"/>
-          <w:szCs w:val="24"/>
-          <w:lang w:val="en-IN"/>
-        </w:rPr>
-        <w:t>So that I get actionable guidance on what to study next.</w:t>
+        <w:t>As a Candidate, I want to receive smart recommendations (e.g., "Practice System Design") when I have weak areas, So that I get actionable guidance on what to study next.</w:t>
       </w:r>
       <w:r>
         <w:rPr>
@@ -22682,31 +22983,7 @@
           <w:szCs w:val="24"/>
           <w:lang w:val="en-IN"/>
         </w:rPr>
-        <w:t>As a Candidate,</w:t>
-      </w:r>
-      <w:r>
-        <w:rPr>
-          <w:sz w:val="24"/>
-          <w:szCs w:val="24"/>
-          <w:lang w:val="en-IN"/>
-        </w:rPr>
-        <w:t xml:space="preserve"> </w:t>
-      </w:r>
-      <w:r>
-        <w:rPr>
-          <w:sz w:val="24"/>
-          <w:szCs w:val="24"/>
-          <w:lang w:val="en-IN"/>
-        </w:rPr>
-        <w:t>I want to dismiss recommendations once I've addressed them,</w:t>
-      </w:r>
-      <w:r>
-        <w:rPr>
-          <w:sz w:val="24"/>
-          <w:szCs w:val="24"/>
-          <w:lang w:val="en-IN"/>
-        </w:rPr>
-        <w:t xml:space="preserve"> </w:t>
+        <w:t xml:space="preserve">As a Candidate, I want to dismiss recommendations once I've addressed them, </w:t>
       </w:r>
       <w:proofErr w:type="gramStart"/>
       <w:r>
@@ -23719,39 +23996,7 @@
           <w:szCs w:val="24"/>
           <w:lang w:val="en-IN"/>
         </w:rPr>
-        <w:t>As an Admin,</w:t>
-      </w:r>
-      <w:r>
-        <w:rPr>
-          <w:sz w:val="24"/>
-          <w:szCs w:val="24"/>
-          <w:lang w:val="en-IN"/>
-        </w:rPr>
-        <w:t xml:space="preserve"> </w:t>
-      </w:r>
-      <w:r>
-        <w:rPr>
-          <w:sz w:val="24"/>
-          <w:szCs w:val="24"/>
-          <w:lang w:val="en-IN"/>
-        </w:rPr>
-        <w:t>I want to view a list of all users (Candidates and Interviewers) with their basic info,</w:t>
-      </w:r>
-      <w:r>
-        <w:rPr>
-          <w:sz w:val="24"/>
-          <w:szCs w:val="24"/>
-          <w:lang w:val="en-IN"/>
-        </w:rPr>
-        <w:t xml:space="preserve"> </w:t>
-      </w:r>
-      <w:r>
-        <w:rPr>
-          <w:sz w:val="24"/>
-          <w:szCs w:val="24"/>
-          <w:lang w:val="en-IN"/>
-        </w:rPr>
-        <w:t>So that I can manage user accounts and monitor platform usage.</w:t>
+        <w:t>As an Admin, I want to view a list of all users (Candidates and Interviewers) with their basic info, So that I can manage user accounts and monitor platform usage.</w:t>
       </w:r>
       <w:r>
         <w:rPr>
@@ -24689,23 +24934,7 @@
           <w:szCs w:val="24"/>
           <w:lang w:val="en-IN"/>
         </w:rPr>
-        <w:t>As an Admin,</w:t>
-      </w:r>
-      <w:r>
-        <w:rPr>
-          <w:sz w:val="24"/>
-          <w:szCs w:val="24"/>
-          <w:lang w:val="en-IN"/>
-        </w:rPr>
-        <w:t xml:space="preserve"> </w:t>
-      </w:r>
-      <w:r>
-        <w:rPr>
-          <w:sz w:val="24"/>
-          <w:szCs w:val="24"/>
-          <w:lang w:val="en-IN"/>
-        </w:rPr>
-        <w:t xml:space="preserve">I want to view all applications across all candidates with their </w:t>
+        <w:t xml:space="preserve">As an Admin, I want to view all applications across all candidates with their </w:t>
       </w:r>
       <w:proofErr w:type="gramStart"/>
       <w:r>
@@ -24723,15 +24952,7 @@
           <w:szCs w:val="24"/>
           <w:lang w:val="en-IN"/>
         </w:rPr>
-        <w:t>,</w:t>
-      </w:r>
-      <w:r>
-        <w:rPr>
-          <w:sz w:val="24"/>
-          <w:szCs w:val="24"/>
-          <w:lang w:val="en-IN"/>
-        </w:rPr>
-        <w:t xml:space="preserve"> </w:t>
+        <w:t xml:space="preserve">, </w:t>
       </w:r>
       <w:proofErr w:type="gramStart"/>
       <w:r>
@@ -25438,23 +25659,7 @@
           <w:szCs w:val="24"/>
           <w:lang w:val="en-IN"/>
         </w:rPr>
-        <w:t>As an Admin,</w:t>
-      </w:r>
-      <w:r>
-        <w:rPr>
-          <w:sz w:val="24"/>
-          <w:szCs w:val="24"/>
-          <w:lang w:val="en-IN"/>
-        </w:rPr>
-        <w:t xml:space="preserve"> </w:t>
-      </w:r>
-      <w:r>
-        <w:rPr>
-          <w:sz w:val="24"/>
-          <w:szCs w:val="24"/>
-          <w:lang w:val="en-IN"/>
-        </w:rPr>
-        <w:t xml:space="preserve">I want to view platform-wide analytics (total applications, success rate, </w:t>
+        <w:t xml:space="preserve">As an Admin, I want to view platform-wide analytics (total applications, success rate, </w:t>
       </w:r>
       <w:proofErr w:type="spellStart"/>
       <w:r>
@@ -25472,23 +25677,7 @@
           <w:szCs w:val="24"/>
           <w:lang w:val="en-IN"/>
         </w:rPr>
-        <w:t xml:space="preserve"> scores, top rejection reasons),</w:t>
-      </w:r>
-      <w:r>
-        <w:rPr>
-          <w:sz w:val="24"/>
-          <w:szCs w:val="24"/>
-          <w:lang w:val="en-IN"/>
-        </w:rPr>
-        <w:t xml:space="preserve"> </w:t>
-      </w:r>
-      <w:r>
-        <w:rPr>
-          <w:sz w:val="24"/>
-          <w:szCs w:val="24"/>
-          <w:lang w:val="en-IN"/>
-        </w:rPr>
-        <w:t>So that I can generate insights and reports for stakeholders.</w:t>
+        <w:t xml:space="preserve"> scores, top rejection reasons), So that I can generate insights and reports for stakeholders.</w:t>
       </w:r>
     </w:p>
     <w:p>
@@ -27991,6 +28180,7 @@
   <w:style w:type="character" w:default="1" w:styleId="DefaultParagraphFont">
     <w:name w:val="Default Paragraph Font"/>
     <w:uiPriority w:val="1"/>
+    <w:semiHidden/>
     <w:unhideWhenUsed/>
   </w:style>
   <w:style w:type="table" w:default="1" w:styleId="TableNormal">

</xml_diff>

<commit_message>
feat(IIQ-AUTH-01): Add JWT setup, login endpoint, security config, register UI, tests and documentation
</commit_message>
<xml_diff>
--- a/docs/InterviewIQ_AgilePlan.docx
+++ b/docs/InterviewIQ_AgilePlan.docx
@@ -21,7 +21,6 @@
         </w:rPr>
         <w:t xml:space="preserve">           </w:t>
       </w:r>
-      <w:proofErr w:type="spellStart"/>
       <w:r>
         <w:rPr>
           <w:b/>
@@ -29,17 +28,7 @@
           <w:sz w:val="28"/>
           <w:szCs w:val="28"/>
         </w:rPr>
-        <w:t>InterviewIQ</w:t>
-      </w:r>
-      <w:proofErr w:type="spellEnd"/>
-      <w:r>
-        <w:rPr>
-          <w:b/>
-          <w:bCs/>
-          <w:sz w:val="28"/>
-          <w:szCs w:val="28"/>
-        </w:rPr>
-        <w:t xml:space="preserve"> – </w:t>
+        <w:t xml:space="preserve">InterviewIQ – </w:t>
       </w:r>
       <w:r>
         <w:rPr>
@@ -228,40 +217,15 @@
           <w:sz w:val="24"/>
           <w:szCs w:val="24"/>
         </w:rPr>
-        <w:t>[IIQ-&lt;</w:t>
-      </w:r>
-      <w:proofErr w:type="spellStart"/>
-      <w:r>
-        <w:rPr>
-          <w:sz w:val="24"/>
-          <w:szCs w:val="24"/>
-        </w:rPr>
-        <w:t>FeatureCode</w:t>
-      </w:r>
-      <w:proofErr w:type="spellEnd"/>
-      <w:r>
-        <w:rPr>
-          <w:sz w:val="24"/>
-          <w:szCs w:val="24"/>
-        </w:rPr>
-        <w:t>&gt;</w:t>
-      </w:r>
-      <w:r>
-        <w:rPr>
-          <w:sz w:val="24"/>
-          <w:szCs w:val="24"/>
-          <w:lang w:val="en-IN"/>
-        </w:rPr>
-        <w:t>-&lt;Number</w:t>
-      </w:r>
-      <w:proofErr w:type="gramStart"/>
-      <w:r>
-        <w:rPr>
-          <w:sz w:val="24"/>
-          <w:szCs w:val="24"/>
-          <w:lang w:val="en-IN"/>
-        </w:rPr>
-        <w:t>&gt;]</w:t>
+        <w:t>[IIQ-&lt;FeatureCode&gt;</w:t>
+      </w:r>
+      <w:r>
+        <w:rPr>
+          <w:sz w:val="24"/>
+          <w:szCs w:val="24"/>
+          <w:lang w:val="en-IN"/>
+        </w:rPr>
+        <w:t>-&lt;Number&gt;]</w:t>
       </w:r>
       <w:r>
         <w:rPr>
@@ -276,15 +240,7 @@
           <w:sz w:val="24"/>
           <w:szCs w:val="24"/>
         </w:rPr>
-        <w:t>As</w:t>
-      </w:r>
-      <w:proofErr w:type="gramEnd"/>
-      <w:r>
-        <w:rPr>
-          <w:sz w:val="24"/>
-          <w:szCs w:val="24"/>
-        </w:rPr>
-        <w:t xml:space="preserve"> a &lt;role&gt;, I want to &lt;goal&gt;, so that &lt;benefit&gt;.</w:t>
+        <w:t>As a &lt;role&gt;, I want to &lt;goal&gt;, so that &lt;benefit&gt;.</w:t>
       </w:r>
     </w:p>
     <w:tbl>
@@ -1224,25 +1180,7 @@
                 <w:szCs w:val="24"/>
                 <w:lang w:val="en-IN"/>
               </w:rPr>
-              <w:t xml:space="preserve">Create Spring Boot project via Spring </w:t>
-            </w:r>
-            <w:proofErr w:type="spellStart"/>
-            <w:r>
-              <w:rPr>
-                <w:sz w:val="24"/>
-                <w:szCs w:val="24"/>
-                <w:lang w:val="en-IN"/>
-              </w:rPr>
-              <w:t>Initializr</w:t>
-            </w:r>
-            <w:proofErr w:type="spellEnd"/>
-            <w:r>
-              <w:rPr>
-                <w:sz w:val="24"/>
-                <w:szCs w:val="24"/>
-                <w:lang w:val="en-IN"/>
-              </w:rPr>
-              <w:t xml:space="preserve"> (Spring Web, JPA, Security, Mail, Validation, Lombok)</w:t>
+              <w:t>Create Spring Boot project via Spring Initializr (Spring Web, JPA, Security, Mail, Validation, Lombok)</w:t>
             </w:r>
           </w:p>
         </w:tc>
@@ -1365,25 +1303,7 @@
                 <w:szCs w:val="24"/>
                 <w:lang w:val="en-IN"/>
               </w:rPr>
-              <w:t xml:space="preserve">Set up package structure: controller / service / repository / entity / </w:t>
-            </w:r>
-            <w:proofErr w:type="spellStart"/>
-            <w:r>
-              <w:rPr>
-                <w:sz w:val="24"/>
-                <w:szCs w:val="24"/>
-                <w:lang w:val="en-IN"/>
-              </w:rPr>
-              <w:t>dto</w:t>
-            </w:r>
-            <w:proofErr w:type="spellEnd"/>
-            <w:r>
-              <w:rPr>
-                <w:sz w:val="24"/>
-                <w:szCs w:val="24"/>
-                <w:lang w:val="en-IN"/>
-              </w:rPr>
-              <w:t xml:space="preserve"> / config / exception</w:t>
+              <w:t>Set up package structure: controller / service / repository / entity / dto / config / exception</w:t>
             </w:r>
           </w:p>
         </w:tc>
@@ -1506,51 +1426,15 @@
                 <w:szCs w:val="24"/>
                 <w:lang w:val="en-IN"/>
               </w:rPr>
-              <w:t xml:space="preserve">Configure </w:t>
-            </w:r>
-            <w:proofErr w:type="spellStart"/>
-            <w:r>
-              <w:rPr>
-                <w:sz w:val="24"/>
-                <w:szCs w:val="24"/>
-                <w:lang w:val="en-IN"/>
-              </w:rPr>
-              <w:t>application.yml</w:t>
-            </w:r>
-            <w:proofErr w:type="spellEnd"/>
-            <w:r>
-              <w:rPr>
-                <w:sz w:val="24"/>
-                <w:szCs w:val="24"/>
-                <w:lang w:val="en-IN"/>
-              </w:rPr>
-              <w:t xml:space="preserve"> for dev/prod profiles</w:t>
-            </w:r>
-            <w:r>
-              <w:rPr>
-                <w:sz w:val="24"/>
-                <w:szCs w:val="24"/>
-                <w:lang w:val="en-IN"/>
-              </w:rPr>
-              <w:t xml:space="preserve"> (</w:t>
-            </w:r>
-            <w:proofErr w:type="spellStart"/>
-            <w:r>
-              <w:rPr>
-                <w:sz w:val="24"/>
-                <w:szCs w:val="24"/>
-                <w:lang w:val="en-IN"/>
-              </w:rPr>
-              <w:t>Application.properties</w:t>
-            </w:r>
-            <w:proofErr w:type="spellEnd"/>
-            <w:r>
-              <w:rPr>
-                <w:sz w:val="24"/>
-                <w:szCs w:val="24"/>
-                <w:lang w:val="en-IN"/>
-              </w:rPr>
-              <w:t>)</w:t>
+              <w:t>Configure application.yml for dev/prod profiles</w:t>
+            </w:r>
+            <w:r>
+              <w:rPr>
+                <w:sz w:val="24"/>
+                <w:szCs w:val="24"/>
+                <w:lang w:val="en-IN"/>
+              </w:rPr>
+              <w:t xml:space="preserve"> (Application.properties)</w:t>
             </w:r>
           </w:p>
         </w:tc>
@@ -1673,18 +1557,8 @@
                 <w:szCs w:val="24"/>
                 <w:lang w:val="en-IN"/>
               </w:rPr>
-              <w:t xml:space="preserve">Set up PostgreSQL locally + configure </w:t>
-            </w:r>
-            <w:proofErr w:type="spellStart"/>
-            <w:r>
-              <w:rPr>
-                <w:sz w:val="24"/>
-                <w:szCs w:val="24"/>
-                <w:lang w:val="en-IN"/>
-              </w:rPr>
-              <w:t>Datasource</w:t>
-            </w:r>
-            <w:proofErr w:type="spellEnd"/>
+              <w:t>Set up PostgreSQL locally + configure Datasource</w:t>
+            </w:r>
           </w:p>
         </w:tc>
         <w:tc>
@@ -2053,25 +1927,7 @@
                 <w:szCs w:val="24"/>
                 <w:lang w:val="en-IN"/>
               </w:rPr>
-              <w:t>Set up global API response wrapper (</w:t>
-            </w:r>
-            <w:proofErr w:type="spellStart"/>
-            <w:r>
-              <w:rPr>
-                <w:sz w:val="24"/>
-                <w:szCs w:val="24"/>
-                <w:lang w:val="en-IN"/>
-              </w:rPr>
-              <w:t>ApiResponse</w:t>
-            </w:r>
-            <w:proofErr w:type="spellEnd"/>
-            <w:r>
-              <w:rPr>
-                <w:sz w:val="24"/>
-                <w:szCs w:val="24"/>
-                <w:lang w:val="en-IN"/>
-              </w:rPr>
-              <w:t xml:space="preserve"> DTO)</w:t>
+              <w:t>Set up global API response wrapper (ApiResponse DTO)</w:t>
             </w:r>
           </w:p>
         </w:tc>
@@ -2268,53 +2124,23 @@
         </w:rPr>
         <w:t xml:space="preserve"> </w:t>
       </w:r>
-      <w:proofErr w:type="gramStart"/>
-      <w:r>
-        <w:rPr>
-          <w:b/>
-          <w:bCs/>
-          <w:sz w:val="24"/>
-          <w:szCs w:val="24"/>
-          <w:lang w:val="en-IN"/>
-        </w:rPr>
-        <w:t>So</w:t>
-      </w:r>
-      <w:proofErr w:type="gramEnd"/>
-      <w:r>
-        <w:rPr>
-          <w:b/>
-          <w:bCs/>
-          <w:sz w:val="24"/>
-          <w:szCs w:val="24"/>
-          <w:lang w:val="en-IN"/>
-        </w:rPr>
-        <w:t xml:space="preserve"> that</w:t>
-      </w:r>
-      <w:r>
-        <w:rPr>
-          <w:sz w:val="24"/>
-          <w:szCs w:val="24"/>
-          <w:lang w:val="en-IN"/>
-        </w:rPr>
-        <w:t xml:space="preserve"> all frontend features are built consistently and </w:t>
-      </w:r>
-      <w:proofErr w:type="spellStart"/>
-      <w:r>
-        <w:rPr>
-          <w:sz w:val="24"/>
-          <w:szCs w:val="24"/>
-          <w:lang w:val="en-IN"/>
-        </w:rPr>
-        <w:t>maintainably</w:t>
-      </w:r>
-      <w:proofErr w:type="spellEnd"/>
-      <w:r>
-        <w:rPr>
-          <w:sz w:val="24"/>
-          <w:szCs w:val="24"/>
-          <w:lang w:val="en-IN"/>
-        </w:rPr>
-        <w:t>.</w:t>
+      <w:r>
+        <w:rPr>
+          <w:b/>
+          <w:bCs/>
+          <w:sz w:val="24"/>
+          <w:szCs w:val="24"/>
+          <w:lang w:val="en-IN"/>
+        </w:rPr>
+        <w:t>So that</w:t>
+      </w:r>
+      <w:r>
+        <w:rPr>
+          <w:sz w:val="24"/>
+          <w:szCs w:val="24"/>
+          <w:lang w:val="en-IN"/>
+        </w:rPr>
+        <w:t xml:space="preserve"> all frontend features are built consistently and maintainably.</w:t>
       </w:r>
       <w:r>
         <w:rPr>
@@ -2931,61 +2757,7 @@
                 <w:szCs w:val="24"/>
                 <w:lang w:val="en-IN"/>
               </w:rPr>
-              <w:t xml:space="preserve">Set up </w:t>
-            </w:r>
-            <w:proofErr w:type="spellStart"/>
-            <w:r>
-              <w:rPr>
-                <w:sz w:val="24"/>
-                <w:szCs w:val="24"/>
-                <w:lang w:val="en-IN"/>
-              </w:rPr>
-              <w:t>AuthContext</w:t>
-            </w:r>
-            <w:proofErr w:type="spellEnd"/>
-            <w:r>
-              <w:rPr>
-                <w:sz w:val="24"/>
-                <w:szCs w:val="24"/>
-                <w:lang w:val="en-IN"/>
-              </w:rPr>
-              <w:t xml:space="preserve"> with </w:t>
-            </w:r>
-            <w:proofErr w:type="spellStart"/>
-            <w:r>
-              <w:rPr>
-                <w:sz w:val="24"/>
-                <w:szCs w:val="24"/>
-                <w:lang w:val="en-IN"/>
-              </w:rPr>
-              <w:t>useContext</w:t>
-            </w:r>
-            <w:proofErr w:type="spellEnd"/>
-            <w:r>
-              <w:rPr>
-                <w:sz w:val="24"/>
-                <w:szCs w:val="24"/>
-                <w:lang w:val="en-IN"/>
-              </w:rPr>
-              <w:t xml:space="preserve"> + </w:t>
-            </w:r>
-            <w:proofErr w:type="spellStart"/>
-            <w:r>
-              <w:rPr>
-                <w:sz w:val="24"/>
-                <w:szCs w:val="24"/>
-                <w:lang w:val="en-IN"/>
-              </w:rPr>
-              <w:t>useReducer</w:t>
-            </w:r>
-            <w:proofErr w:type="spellEnd"/>
-            <w:r>
-              <w:rPr>
-                <w:sz w:val="24"/>
-                <w:szCs w:val="24"/>
-                <w:lang w:val="en-IN"/>
-              </w:rPr>
-              <w:t xml:space="preserve"> for auth state (with role)</w:t>
+              <w:t>Set up AuthContext with useContext + useReducer for auth state (with role)</w:t>
             </w:r>
           </w:p>
         </w:tc>
@@ -3164,6 +2936,14 @@
                 <w:lang w:val="en-IN"/>
               </w:rPr>
             </w:pPr>
+            <w:r>
+              <w:rPr>
+                <w:sz w:val="24"/>
+                <w:szCs w:val="24"/>
+                <w:lang w:val="en-IN"/>
+              </w:rPr>
+              <w:t>45 mins</w:t>
+            </w:r>
           </w:p>
         </w:tc>
       </w:tr>
@@ -3215,25 +2995,7 @@
                 <w:szCs w:val="24"/>
                 <w:lang w:val="en-IN"/>
               </w:rPr>
-              <w:t xml:space="preserve">Create reusable components: Button, Input, Card, Modal, Sidebar, </w:t>
-            </w:r>
-            <w:proofErr w:type="spellStart"/>
-            <w:r>
-              <w:rPr>
-                <w:sz w:val="24"/>
-                <w:szCs w:val="24"/>
-                <w:lang w:val="en-IN"/>
-              </w:rPr>
-              <w:t>TopBar</w:t>
-            </w:r>
-            <w:proofErr w:type="spellEnd"/>
-            <w:r>
-              <w:rPr>
-                <w:sz w:val="24"/>
-                <w:szCs w:val="24"/>
-                <w:lang w:val="en-IN"/>
-              </w:rPr>
-              <w:t>, Table</w:t>
+              <w:t>Create reusable components: Button, Input, Card, Modal, Sidebar, TopBar, Table</w:t>
             </w:r>
           </w:p>
         </w:tc>
@@ -3383,6 +3145,8 @@
     <w:p>
       <w:pPr>
         <w:rPr>
+          <w:b/>
+          <w:bCs/>
           <w:sz w:val="24"/>
           <w:szCs w:val="24"/>
           <w:lang w:val="en-IN"/>
@@ -3396,14 +3160,25 @@
         </w:rPr>
         <w:br/>
       </w:r>
-      <w:r>
-        <w:rPr>
-          <w:b/>
-          <w:bCs/>
-          <w:sz w:val="24"/>
-          <w:szCs w:val="24"/>
-          <w:lang w:val="en-IN"/>
-        </w:rPr>
+    </w:p>
+    <w:p>
+      <w:pPr>
+        <w:ind w:firstLine="720"/>
+        <w:rPr>
+          <w:sz w:val="24"/>
+          <w:szCs w:val="24"/>
+          <w:lang w:val="en-IN"/>
+        </w:rPr>
+      </w:pPr>
+      <w:r>
+        <w:rPr>
+          <w:b/>
+          <w:bCs/>
+          <w:sz w:val="24"/>
+          <w:szCs w:val="24"/>
+          <w:lang w:val="en-IN"/>
+        </w:rPr>
+        <w:lastRenderedPageBreak/>
         <w:t xml:space="preserve">User Story: </w:t>
       </w:r>
       <w:r>
@@ -3488,16 +3263,7 @@
           <w:szCs w:val="24"/>
           <w:lang w:val="en-IN"/>
         </w:rPr>
-        <w:t xml:space="preserve"> containerize the application using Docker and set up a basic CI/CD </w:t>
-      </w:r>
-      <w:r>
-        <w:rPr>
-          <w:sz w:val="24"/>
-          <w:szCs w:val="24"/>
-          <w:lang w:val="en-IN"/>
-        </w:rPr>
-        <w:lastRenderedPageBreak/>
-        <w:t>pipeline,</w:t>
+        <w:t xml:space="preserve"> containerize the application using Docker and set up a basic CI/CD pipeline,</w:t>
       </w:r>
       <w:r>
         <w:rPr>
@@ -3507,27 +3273,15 @@
         </w:rPr>
         <w:t xml:space="preserve"> </w:t>
       </w:r>
-      <w:proofErr w:type="gramStart"/>
-      <w:r>
-        <w:rPr>
-          <w:b/>
-          <w:bCs/>
-          <w:sz w:val="24"/>
-          <w:szCs w:val="24"/>
-          <w:lang w:val="en-IN"/>
-        </w:rPr>
-        <w:t>So</w:t>
-      </w:r>
-      <w:proofErr w:type="gramEnd"/>
-      <w:r>
-        <w:rPr>
-          <w:b/>
-          <w:bCs/>
-          <w:sz w:val="24"/>
-          <w:szCs w:val="24"/>
-          <w:lang w:val="en-IN"/>
-        </w:rPr>
-        <w:t xml:space="preserve"> that</w:t>
+      <w:r>
+        <w:rPr>
+          <w:b/>
+          <w:bCs/>
+          <w:sz w:val="24"/>
+          <w:szCs w:val="24"/>
+          <w:lang w:val="en-IN"/>
+        </w:rPr>
+        <w:t>So that</w:t>
       </w:r>
       <w:r>
         <w:rPr>
@@ -3801,25 +3555,7 @@
                 <w:szCs w:val="24"/>
                 <w:lang w:val="en-IN"/>
               </w:rPr>
-              <w:t xml:space="preserve">Write </w:t>
-            </w:r>
-            <w:proofErr w:type="spellStart"/>
-            <w:r>
-              <w:rPr>
-                <w:sz w:val="24"/>
-                <w:szCs w:val="24"/>
-                <w:lang w:val="en-IN"/>
-              </w:rPr>
-              <w:t>Dockerfile</w:t>
-            </w:r>
-            <w:proofErr w:type="spellEnd"/>
-            <w:r>
-              <w:rPr>
-                <w:sz w:val="24"/>
-                <w:szCs w:val="24"/>
-                <w:lang w:val="en-IN"/>
-              </w:rPr>
-              <w:t xml:space="preserve"> for Spring Boot app</w:t>
+              <w:t>Write Dockerfile for Spring Boot app</w:t>
             </w:r>
           </w:p>
         </w:tc>
@@ -3934,25 +3670,7 @@
                 <w:szCs w:val="24"/>
                 <w:lang w:val="en-IN"/>
               </w:rPr>
-              <w:t xml:space="preserve">Write </w:t>
-            </w:r>
-            <w:proofErr w:type="spellStart"/>
-            <w:r>
-              <w:rPr>
-                <w:sz w:val="24"/>
-                <w:szCs w:val="24"/>
-                <w:lang w:val="en-IN"/>
-              </w:rPr>
-              <w:t>Dockerfile</w:t>
-            </w:r>
-            <w:proofErr w:type="spellEnd"/>
-            <w:r>
-              <w:rPr>
-                <w:sz w:val="24"/>
-                <w:szCs w:val="24"/>
-                <w:lang w:val="en-IN"/>
-              </w:rPr>
-              <w:t xml:space="preserve"> for React app with Nginx</w:t>
+              <w:t>Write Dockerfile for React app with Nginx</w:t>
             </w:r>
           </w:p>
         </w:tc>
@@ -4067,36 +3785,8 @@
                 <w:szCs w:val="24"/>
                 <w:lang w:val="en-IN"/>
               </w:rPr>
-              <w:t>Create docker-</w:t>
-            </w:r>
-            <w:proofErr w:type="spellStart"/>
-            <w:r>
-              <w:rPr>
-                <w:sz w:val="24"/>
-                <w:szCs w:val="24"/>
-                <w:lang w:val="en-IN"/>
-              </w:rPr>
-              <w:t>compose.yml</w:t>
-            </w:r>
-            <w:proofErr w:type="spellEnd"/>
-            <w:r>
-              <w:rPr>
-                <w:sz w:val="24"/>
-                <w:szCs w:val="24"/>
-                <w:lang w:val="en-IN"/>
-              </w:rPr>
-              <w:t xml:space="preserve"> with services: backend, frontend, </w:t>
-            </w:r>
-            <w:proofErr w:type="spellStart"/>
-            <w:r>
-              <w:rPr>
-                <w:sz w:val="24"/>
-                <w:szCs w:val="24"/>
-                <w:lang w:val="en-IN"/>
-              </w:rPr>
-              <w:t>postgres</w:t>
-            </w:r>
-            <w:proofErr w:type="spellEnd"/>
+              <w:t>Create docker-compose.yml with services: backend, frontend, postgres</w:t>
+            </w:r>
           </w:p>
         </w:tc>
         <w:tc>
@@ -4696,25 +4386,14 @@
         </w:rPr>
         <w:br/>
       </w:r>
-      <w:proofErr w:type="spellStart"/>
-      <w:r>
-        <w:rPr>
-          <w:b/>
-          <w:bCs/>
-          <w:sz w:val="24"/>
-          <w:szCs w:val="24"/>
-        </w:rPr>
-        <w:t>UserStory</w:t>
-      </w:r>
-      <w:proofErr w:type="spellEnd"/>
-      <w:r>
-        <w:rPr>
-          <w:b/>
-          <w:bCs/>
-          <w:sz w:val="24"/>
-          <w:szCs w:val="24"/>
-        </w:rPr>
-        <w:t>: [IIQ-AUTH-01]</w:t>
+      <w:r>
+        <w:rPr>
+          <w:b/>
+          <w:bCs/>
+          <w:sz w:val="24"/>
+          <w:szCs w:val="24"/>
+        </w:rPr>
+        <w:t>UserStory: [IIQ-AUTH-01]</w:t>
       </w:r>
       <w:r>
         <w:rPr>
@@ -4763,23 +4442,7 @@
           <w:sz w:val="24"/>
           <w:szCs w:val="24"/>
         </w:rPr>
-        <w:t xml:space="preserve"> that I can access the </w:t>
-      </w:r>
-      <w:proofErr w:type="spellStart"/>
-      <w:r>
-        <w:rPr>
-          <w:sz w:val="24"/>
-          <w:szCs w:val="24"/>
-        </w:rPr>
-        <w:t>InterviewIQ</w:t>
-      </w:r>
-      <w:proofErr w:type="spellEnd"/>
-      <w:r>
-        <w:rPr>
-          <w:sz w:val="24"/>
-          <w:szCs w:val="24"/>
-        </w:rPr>
-        <w:t xml:space="preserve"> portal with the right permissions.</w:t>
+        <w:t xml:space="preserve"> that I can access the InterviewIQ portal with the right permissions.</w:t>
       </w:r>
       <w:r>
         <w:rPr>
@@ -5044,18 +4707,8 @@
                 <w:szCs w:val="24"/>
                 <w:lang w:val="en-IN"/>
               </w:rPr>
-              <w:t xml:space="preserve">), </w:t>
-            </w:r>
-            <w:proofErr w:type="spellStart"/>
-            <w:r>
-              <w:rPr>
-                <w:sz w:val="24"/>
-                <w:szCs w:val="24"/>
-                <w:lang w:val="en-IN"/>
-              </w:rPr>
-              <w:t>createdAt</w:t>
-            </w:r>
-            <w:proofErr w:type="spellEnd"/>
+              <w:t>), createdAt</w:t>
+            </w:r>
           </w:p>
         </w:tc>
         <w:tc>
@@ -5153,6 +4806,7 @@
                 <w:szCs w:val="24"/>
                 <w:lang w:val="en-IN"/>
               </w:rPr>
+              <w:lastRenderedPageBreak/>
               <w:t>T2</w:t>
             </w:r>
           </w:p>
@@ -5177,25 +4831,7 @@
                 <w:szCs w:val="24"/>
                 <w:lang w:val="en-IN"/>
               </w:rPr>
-              <w:t xml:space="preserve">Create </w:t>
-            </w:r>
-            <w:proofErr w:type="spellStart"/>
-            <w:r>
-              <w:rPr>
-                <w:sz w:val="24"/>
-                <w:szCs w:val="24"/>
-                <w:lang w:val="en-IN"/>
-              </w:rPr>
-              <w:t>UserRepository</w:t>
-            </w:r>
-            <w:proofErr w:type="spellEnd"/>
-            <w:r>
-              <w:rPr>
-                <w:sz w:val="24"/>
-                <w:szCs w:val="24"/>
-                <w:lang w:val="en-IN"/>
-              </w:rPr>
-              <w:t xml:space="preserve"> (Spring Data JPA)</w:t>
+              <w:t>Create UserRepository (Spring Data JPA)</w:t>
             </w:r>
           </w:p>
         </w:tc>
@@ -5294,7 +4930,6 @@
                 <w:szCs w:val="24"/>
                 <w:lang w:val="en-IN"/>
               </w:rPr>
-              <w:lastRenderedPageBreak/>
               <w:t>T3</w:t>
             </w:r>
           </w:p>
@@ -5319,25 +4954,7 @@
                 <w:szCs w:val="24"/>
                 <w:lang w:val="en-IN"/>
               </w:rPr>
-              <w:t>Build POST /</w:t>
-            </w:r>
-            <w:proofErr w:type="spellStart"/>
-            <w:r>
-              <w:rPr>
-                <w:sz w:val="24"/>
-                <w:szCs w:val="24"/>
-                <w:lang w:val="en-IN"/>
-              </w:rPr>
-              <w:t>api</w:t>
-            </w:r>
-            <w:proofErr w:type="spellEnd"/>
-            <w:r>
-              <w:rPr>
-                <w:sz w:val="24"/>
-                <w:szCs w:val="24"/>
-                <w:lang w:val="en-IN"/>
-              </w:rPr>
-              <w:t>/auth/register endpoint with request validation</w:t>
+              <w:t>Build POST /api/auth/register endpoint with request validation</w:t>
             </w:r>
           </w:p>
         </w:tc>
@@ -5401,6 +5018,14 @@
                 <w:lang w:val="en-IN"/>
               </w:rPr>
             </w:pPr>
+            <w:r>
+              <w:rPr>
+                <w:sz w:val="24"/>
+                <w:szCs w:val="24"/>
+                <w:lang w:val="en-IN"/>
+              </w:rPr>
+              <w:t>1h 45 mins</w:t>
+            </w:r>
           </w:p>
         </w:tc>
       </w:tr>
@@ -5452,25 +5077,7 @@
                 <w:szCs w:val="24"/>
                 <w:lang w:val="en-IN"/>
               </w:rPr>
-              <w:t xml:space="preserve">Implement </w:t>
-            </w:r>
-            <w:proofErr w:type="spellStart"/>
-            <w:r>
-              <w:rPr>
-                <w:sz w:val="24"/>
-                <w:szCs w:val="24"/>
-                <w:lang w:val="en-IN"/>
-              </w:rPr>
-              <w:t>BCrypt</w:t>
-            </w:r>
-            <w:proofErr w:type="spellEnd"/>
-            <w:r>
-              <w:rPr>
-                <w:sz w:val="24"/>
-                <w:szCs w:val="24"/>
-                <w:lang w:val="en-IN"/>
-              </w:rPr>
-              <w:t xml:space="preserve"> password encoding via Spring Security</w:t>
+              <w:t>Implement BCrypt password encoding via Spring Security</w:t>
             </w:r>
           </w:p>
         </w:tc>
@@ -5657,6 +5264,14 @@
                 <w:lang w:val="en-IN"/>
               </w:rPr>
             </w:pPr>
+            <w:r>
+              <w:rPr>
+                <w:sz w:val="24"/>
+                <w:szCs w:val="24"/>
+                <w:lang w:val="en-IN"/>
+              </w:rPr>
+              <w:t>4h</w:t>
+            </w:r>
           </w:p>
         </w:tc>
       </w:tr>
@@ -5772,6 +5387,14 @@
                 <w:lang w:val="en-IN"/>
               </w:rPr>
             </w:pPr>
+            <w:r>
+              <w:rPr>
+                <w:sz w:val="24"/>
+                <w:szCs w:val="24"/>
+                <w:lang w:val="en-IN"/>
+              </w:rPr>
+              <w:t>45 mins</w:t>
+            </w:r>
           </w:p>
         </w:tc>
       </w:tr>
@@ -5895,6 +5518,14 @@
                 <w:lang w:val="en-IN"/>
               </w:rPr>
             </w:pPr>
+            <w:r>
+              <w:rPr>
+                <w:sz w:val="24"/>
+                <w:szCs w:val="24"/>
+                <w:lang w:val="en-IN"/>
+              </w:rPr>
+              <w:t>3h</w:t>
+            </w:r>
           </w:p>
         </w:tc>
       </w:tr>
@@ -6001,23 +5632,13 @@
         </w:rPr>
         <w:t xml:space="preserve"> </w:t>
       </w:r>
-      <w:proofErr w:type="gramStart"/>
-      <w:r>
-        <w:rPr>
-          <w:sz w:val="24"/>
-          <w:szCs w:val="24"/>
-          <w:lang w:val="en-IN"/>
-        </w:rPr>
-        <w:t>So</w:t>
-      </w:r>
-      <w:proofErr w:type="gramEnd"/>
-      <w:r>
-        <w:rPr>
-          <w:sz w:val="24"/>
-          <w:szCs w:val="24"/>
-          <w:lang w:val="en-IN"/>
-        </w:rPr>
-        <w:t xml:space="preserve"> that I can securely access my dashboard and features.</w:t>
+      <w:r>
+        <w:rPr>
+          <w:sz w:val="24"/>
+          <w:szCs w:val="24"/>
+          <w:lang w:val="en-IN"/>
+        </w:rPr>
+        <w:t>So that I can securely access my dashboard and features.</w:t>
       </w:r>
       <w:r>
         <w:rPr>
@@ -6284,51 +5905,15 @@
                 <w:szCs w:val="24"/>
                 <w:lang w:val="en-IN"/>
               </w:rPr>
-              <w:t>Set up Spring Security configuration (</w:t>
-            </w:r>
-            <w:proofErr w:type="spellStart"/>
-            <w:r>
-              <w:rPr>
-                <w:sz w:val="24"/>
-                <w:szCs w:val="24"/>
-                <w:lang w:val="en-IN"/>
-              </w:rPr>
-              <w:t>SecurityFilterChain</w:t>
-            </w:r>
-            <w:proofErr w:type="spellEnd"/>
-            <w:r>
-              <w:rPr>
-                <w:sz w:val="24"/>
-                <w:szCs w:val="24"/>
-                <w:lang w:val="en-IN"/>
-              </w:rPr>
-              <w:t>)</w:t>
-            </w:r>
-            <w:r>
-              <w:rPr>
-                <w:sz w:val="24"/>
-                <w:szCs w:val="24"/>
-                <w:lang w:val="en-IN"/>
-              </w:rPr>
-              <w:t xml:space="preserve"> with </w:t>
-            </w:r>
-            <w:proofErr w:type="gramStart"/>
-            <w:r>
-              <w:rPr>
-                <w:sz w:val="24"/>
-                <w:szCs w:val="24"/>
-                <w:lang w:val="en-IN"/>
-              </w:rPr>
-              <w:t>role based</w:t>
-            </w:r>
-            <w:proofErr w:type="gramEnd"/>
-            <w:r>
-              <w:rPr>
-                <w:sz w:val="24"/>
-                <w:szCs w:val="24"/>
-                <w:lang w:val="en-IN"/>
-              </w:rPr>
-              <w:t xml:space="preserve"> access</w:t>
+              <w:t>Set up Spring Security configuration (SecurityFilterChain)</w:t>
+            </w:r>
+            <w:r>
+              <w:rPr>
+                <w:sz w:val="24"/>
+                <w:szCs w:val="24"/>
+                <w:lang w:val="en-IN"/>
+              </w:rPr>
+              <w:t xml:space="preserve"> with role based access</w:t>
             </w:r>
           </w:p>
         </w:tc>
@@ -6392,6 +5977,14 @@
                 <w:lang w:val="en-IN"/>
               </w:rPr>
             </w:pPr>
+            <w:r>
+              <w:rPr>
+                <w:sz w:val="24"/>
+                <w:szCs w:val="24"/>
+                <w:lang w:val="en-IN"/>
+              </w:rPr>
+              <w:t>1.5h</w:t>
+            </w:r>
           </w:p>
         </w:tc>
       </w:tr>
@@ -6516,6 +6109,14 @@
                 <w:lang w:val="en-IN"/>
               </w:rPr>
             </w:pPr>
+            <w:r>
+              <w:rPr>
+                <w:sz w:val="24"/>
+                <w:szCs w:val="24"/>
+                <w:lang w:val="en-IN"/>
+              </w:rPr>
+              <w:t>3h45mins</w:t>
+            </w:r>
           </w:p>
         </w:tc>
       </w:tr>
@@ -6568,25 +6169,7 @@
                 <w:szCs w:val="24"/>
                 <w:lang w:val="en-IN"/>
               </w:rPr>
-              <w:t>Build POST /</w:t>
-            </w:r>
-            <w:proofErr w:type="spellStart"/>
-            <w:r>
-              <w:rPr>
-                <w:sz w:val="24"/>
-                <w:szCs w:val="24"/>
-                <w:lang w:val="en-IN"/>
-              </w:rPr>
-              <w:t>api</w:t>
-            </w:r>
-            <w:proofErr w:type="spellEnd"/>
-            <w:r>
-              <w:rPr>
-                <w:sz w:val="24"/>
-                <w:szCs w:val="24"/>
-                <w:lang w:val="en-IN"/>
-              </w:rPr>
-              <w:t>/auth/login endpoint returning JWT token</w:t>
+              <w:t>Build POST /api/auth/login endpoint returning JWT token</w:t>
             </w:r>
           </w:p>
         </w:tc>
@@ -6818,25 +6401,7 @@
                 <w:szCs w:val="24"/>
                 <w:lang w:val="en-IN"/>
               </w:rPr>
-              <w:t xml:space="preserve">Store JWT token in </w:t>
-            </w:r>
-            <w:proofErr w:type="spellStart"/>
-            <w:r>
-              <w:rPr>
-                <w:sz w:val="24"/>
-                <w:szCs w:val="24"/>
-                <w:lang w:val="en-IN"/>
-              </w:rPr>
-              <w:t>localStorage</w:t>
-            </w:r>
-            <w:proofErr w:type="spellEnd"/>
-            <w:r>
-              <w:rPr>
-                <w:sz w:val="24"/>
-                <w:szCs w:val="24"/>
-                <w:lang w:val="en-IN"/>
-              </w:rPr>
-              <w:t xml:space="preserve"> and set Axios auth headers</w:t>
+              <w:t>Store JWT token in localStorage and set Axios auth headers</w:t>
             </w:r>
           </w:p>
         </w:tc>
@@ -6967,39 +6532,7 @@
                 <w:sz w:val="24"/>
                 <w:szCs w:val="24"/>
               </w:rPr>
-              <w:t>(</w:t>
-            </w:r>
-            <w:proofErr w:type="spellStart"/>
-            <w:r>
-              <w:rPr>
-                <w:sz w:val="24"/>
-                <w:szCs w:val="24"/>
-              </w:rPr>
-              <w:t>Candidate→Dashboard</w:t>
-            </w:r>
-            <w:proofErr w:type="spellEnd"/>
-            <w:r>
-              <w:rPr>
-                <w:sz w:val="24"/>
-                <w:szCs w:val="24"/>
-              </w:rPr>
-              <w:t xml:space="preserve">, </w:t>
-            </w:r>
-            <w:proofErr w:type="spellStart"/>
-            <w:r>
-              <w:rPr>
-                <w:sz w:val="24"/>
-                <w:szCs w:val="24"/>
-              </w:rPr>
-              <w:t>Admin→Admin</w:t>
-            </w:r>
-            <w:proofErr w:type="spellEnd"/>
-            <w:r>
-              <w:rPr>
-                <w:sz w:val="24"/>
-                <w:szCs w:val="24"/>
-              </w:rPr>
-              <w:t xml:space="preserve"> Panel)</w:t>
+              <w:t>(Candidate→Dashboard, Admin→Admin Panel)</w:t>
             </w:r>
           </w:p>
         </w:tc>
@@ -7209,6 +6742,7 @@
           <w:szCs w:val="24"/>
           <w:lang w:val="en-IN"/>
         </w:rPr>
+        <w:lastRenderedPageBreak/>
         <w:br/>
       </w:r>
       <w:r>
@@ -7229,7 +6763,6 @@
           <w:szCs w:val="24"/>
           <w:lang w:val="en-IN"/>
         </w:rPr>
-        <w:lastRenderedPageBreak/>
         <w:t xml:space="preserve">User Story: </w:t>
       </w:r>
       <w:r>
@@ -7278,25 +6811,7 @@
           <w:szCs w:val="24"/>
           <w:lang w:val="en-IN"/>
         </w:rPr>
-        <w:t xml:space="preserve">As a logged-in user, I want to view and edit my profile (name, skills, experience, notification preferences), So that my information is accurate and </w:t>
-      </w:r>
-      <w:proofErr w:type="gramStart"/>
-      <w:r>
-        <w:rPr>
-          <w:sz w:val="24"/>
-          <w:szCs w:val="24"/>
-          <w:lang w:val="en-IN"/>
-        </w:rPr>
-        <w:t>up-to-date</w:t>
-      </w:r>
-      <w:proofErr w:type="gramEnd"/>
-      <w:r>
-        <w:rPr>
-          <w:sz w:val="24"/>
-          <w:szCs w:val="24"/>
-          <w:lang w:val="en-IN"/>
-        </w:rPr>
-        <w:t>.</w:t>
+        <w:t>As a logged-in user, I want to view and edit my profile (name, skills, experience, notification preferences), So that my information is accurate and up-to-date.</w:t>
       </w:r>
       <w:r>
         <w:rPr>
@@ -7560,25 +7075,7 @@
                 <w:szCs w:val="24"/>
                 <w:lang w:val="en-IN"/>
               </w:rPr>
-              <w:t xml:space="preserve">Create </w:t>
-            </w:r>
-            <w:proofErr w:type="spellStart"/>
-            <w:r>
-              <w:rPr>
-                <w:sz w:val="24"/>
-                <w:szCs w:val="24"/>
-                <w:lang w:val="en-IN"/>
-              </w:rPr>
-              <w:t>UserProfile</w:t>
-            </w:r>
-            <w:proofErr w:type="spellEnd"/>
-            <w:r>
-              <w:rPr>
-                <w:sz w:val="24"/>
-                <w:szCs w:val="24"/>
-                <w:lang w:val="en-IN"/>
-              </w:rPr>
-              <w:t xml:space="preserve"> entity and one-to-one relation with User</w:t>
+              <w:t>Create UserProfile entity and one-to-one relation with User</w:t>
             </w:r>
           </w:p>
         </w:tc>
@@ -7693,43 +7190,7 @@
                 <w:szCs w:val="24"/>
                 <w:lang w:val="en-IN"/>
               </w:rPr>
-              <w:t>Build GET /</w:t>
-            </w:r>
-            <w:proofErr w:type="spellStart"/>
-            <w:r>
-              <w:rPr>
-                <w:sz w:val="24"/>
-                <w:szCs w:val="24"/>
-                <w:lang w:val="en-IN"/>
-              </w:rPr>
-              <w:t>api</w:t>
-            </w:r>
-            <w:proofErr w:type="spellEnd"/>
-            <w:r>
-              <w:rPr>
-                <w:sz w:val="24"/>
-                <w:szCs w:val="24"/>
-                <w:lang w:val="en-IN"/>
-              </w:rPr>
-              <w:t>/users/me and PUT /</w:t>
-            </w:r>
-            <w:proofErr w:type="spellStart"/>
-            <w:r>
-              <w:rPr>
-                <w:sz w:val="24"/>
-                <w:szCs w:val="24"/>
-                <w:lang w:val="en-IN"/>
-              </w:rPr>
-              <w:t>api</w:t>
-            </w:r>
-            <w:proofErr w:type="spellEnd"/>
-            <w:r>
-              <w:rPr>
-                <w:sz w:val="24"/>
-                <w:szCs w:val="24"/>
-                <w:lang w:val="en-IN"/>
-              </w:rPr>
-              <w:t>/users/me endpoints</w:t>
+              <w:t>Build GET /api/users/me and PUT /api/users/me endpoints</w:t>
             </w:r>
           </w:p>
         </w:tc>
@@ -8399,25 +7860,7 @@
           <w:szCs w:val="24"/>
           <w:lang w:val="en-IN"/>
         </w:rPr>
-        <w:t xml:space="preserve">As a Candidate, I want to add a new job application with company name, role, and initial status, </w:t>
-      </w:r>
-      <w:proofErr w:type="gramStart"/>
-      <w:r>
-        <w:rPr>
-          <w:sz w:val="24"/>
-          <w:szCs w:val="24"/>
-          <w:lang w:val="en-IN"/>
-        </w:rPr>
-        <w:t>So</w:t>
-      </w:r>
-      <w:proofErr w:type="gramEnd"/>
-      <w:r>
-        <w:rPr>
-          <w:sz w:val="24"/>
-          <w:szCs w:val="24"/>
-          <w:lang w:val="en-IN"/>
-        </w:rPr>
-        <w:t xml:space="preserve"> that I can start tracking my application journey from the beginning.</w:t>
+        <w:t>As a Candidate, I want to add a new job application with company name, role, and initial status, So that I can start tracking my application journey from the beginning.</w:t>
       </w:r>
       <w:r>
         <w:rPr>
@@ -8524,6 +7967,7 @@
                 <w:szCs w:val="24"/>
                 <w:lang w:val="en-IN"/>
               </w:rPr>
+              <w:lastRenderedPageBreak/>
               <w:t>#</w:t>
             </w:r>
           </w:p>
@@ -8685,90 +8129,8 @@
                 <w:szCs w:val="24"/>
                 <w:lang w:val="en-IN"/>
               </w:rPr>
-              <w:t xml:space="preserve">Create Application entity: id, </w:t>
-            </w:r>
-            <w:proofErr w:type="spellStart"/>
-            <w:r>
-              <w:rPr>
-                <w:sz w:val="24"/>
-                <w:szCs w:val="24"/>
-                <w:lang w:val="en-IN"/>
-              </w:rPr>
-              <w:t>candidateId</w:t>
-            </w:r>
-            <w:proofErr w:type="spellEnd"/>
-            <w:r>
-              <w:rPr>
-                <w:sz w:val="24"/>
-                <w:szCs w:val="24"/>
-                <w:lang w:val="en-IN"/>
-              </w:rPr>
-              <w:t xml:space="preserve">, </w:t>
-            </w:r>
-            <w:proofErr w:type="spellStart"/>
-            <w:r>
-              <w:rPr>
-                <w:sz w:val="24"/>
-                <w:szCs w:val="24"/>
-                <w:lang w:val="en-IN"/>
-              </w:rPr>
-              <w:t>companyName</w:t>
-            </w:r>
-            <w:proofErr w:type="spellEnd"/>
-            <w:r>
-              <w:rPr>
-                <w:sz w:val="24"/>
-                <w:szCs w:val="24"/>
-                <w:lang w:val="en-IN"/>
-              </w:rPr>
-              <w:t xml:space="preserve">, </w:t>
-            </w:r>
-            <w:proofErr w:type="spellStart"/>
-            <w:r>
-              <w:rPr>
-                <w:sz w:val="24"/>
-                <w:szCs w:val="24"/>
-                <w:lang w:val="en-IN"/>
-              </w:rPr>
-              <w:t>roleName</w:t>
-            </w:r>
-            <w:proofErr w:type="spellEnd"/>
-            <w:r>
-              <w:rPr>
-                <w:sz w:val="24"/>
-                <w:szCs w:val="24"/>
-                <w:lang w:val="en-IN"/>
-              </w:rPr>
-              <w:t xml:space="preserve">, status (APPLIED/INTERVIEWING/REJECTED/OFFER), </w:t>
-            </w:r>
-            <w:proofErr w:type="spellStart"/>
-            <w:r>
-              <w:rPr>
-                <w:sz w:val="24"/>
-                <w:szCs w:val="24"/>
-                <w:lang w:val="en-IN"/>
-              </w:rPr>
-              <w:t>appliedDate</w:t>
-            </w:r>
-            <w:proofErr w:type="spellEnd"/>
-            <w:r>
-              <w:rPr>
-                <w:sz w:val="24"/>
-                <w:szCs w:val="24"/>
-                <w:lang w:val="en-IN"/>
-              </w:rPr>
-              <w:t xml:space="preserve">, </w:t>
-            </w:r>
-            <w:proofErr w:type="spellStart"/>
-            <w:r>
-              <w:rPr>
-                <w:sz w:val="24"/>
-                <w:szCs w:val="24"/>
-                <w:lang w:val="en-IN"/>
-              </w:rPr>
-              <w:t>createdAt</w:t>
-            </w:r>
-            <w:proofErr w:type="spellEnd"/>
+              <w:t>Create Application entity: id, candidateId, companyName, roleName, status (APPLIED/INTERVIEWING/REJECTED/OFFER), appliedDate, createdAt</w:t>
+            </w:r>
           </w:p>
         </w:tc>
         <w:tc>
@@ -8858,7 +8220,6 @@
                 <w:szCs w:val="24"/>
                 <w:lang w:val="en-IN"/>
               </w:rPr>
-              <w:lastRenderedPageBreak/>
               <w:t>T2</w:t>
             </w:r>
           </w:p>
@@ -8883,25 +8244,7 @@
                 <w:szCs w:val="24"/>
                 <w:lang w:val="en-IN"/>
               </w:rPr>
-              <w:t xml:space="preserve">Create </w:t>
-            </w:r>
-            <w:proofErr w:type="spellStart"/>
-            <w:r>
-              <w:rPr>
-                <w:sz w:val="24"/>
-                <w:szCs w:val="24"/>
-                <w:lang w:val="en-IN"/>
-              </w:rPr>
-              <w:t>ApplicationRepository</w:t>
-            </w:r>
-            <w:proofErr w:type="spellEnd"/>
-            <w:r>
-              <w:rPr>
-                <w:sz w:val="24"/>
-                <w:szCs w:val="24"/>
-                <w:lang w:val="en-IN"/>
-              </w:rPr>
-              <w:t xml:space="preserve"> with custom queries (by candidate, by status, by date range)</w:t>
+              <w:t>Create ApplicationRepository with custom queries (by candidate, by status, by date range)</w:t>
             </w:r>
           </w:p>
         </w:tc>
@@ -9016,25 +8359,7 @@
                 <w:szCs w:val="24"/>
                 <w:lang w:val="en-IN"/>
               </w:rPr>
-              <w:t>Build POST /</w:t>
-            </w:r>
-            <w:proofErr w:type="spellStart"/>
-            <w:r>
-              <w:rPr>
-                <w:sz w:val="24"/>
-                <w:szCs w:val="24"/>
-                <w:lang w:val="en-IN"/>
-              </w:rPr>
-              <w:t>api</w:t>
-            </w:r>
-            <w:proofErr w:type="spellEnd"/>
-            <w:r>
-              <w:rPr>
-                <w:sz w:val="24"/>
-                <w:szCs w:val="24"/>
-                <w:lang w:val="en-IN"/>
-              </w:rPr>
-              <w:t>/applications endpoint with validation</w:t>
+              <w:t>Build POST /api/applications endpoint with validation</w:t>
             </w:r>
           </w:p>
         </w:tc>
@@ -9149,43 +8474,7 @@
                 <w:szCs w:val="24"/>
                 <w:lang w:val="en-IN"/>
               </w:rPr>
-              <w:t>Build GET /</w:t>
-            </w:r>
-            <w:proofErr w:type="spellStart"/>
-            <w:r>
-              <w:rPr>
-                <w:sz w:val="24"/>
-                <w:szCs w:val="24"/>
-                <w:lang w:val="en-IN"/>
-              </w:rPr>
-              <w:t>api</w:t>
-            </w:r>
-            <w:proofErr w:type="spellEnd"/>
-            <w:r>
-              <w:rPr>
-                <w:sz w:val="24"/>
-                <w:szCs w:val="24"/>
-                <w:lang w:val="en-IN"/>
-              </w:rPr>
-              <w:t>/</w:t>
-            </w:r>
-            <w:proofErr w:type="spellStart"/>
-            <w:r>
-              <w:rPr>
-                <w:sz w:val="24"/>
-                <w:szCs w:val="24"/>
-                <w:lang w:val="en-IN"/>
-              </w:rPr>
-              <w:t>applications?candidateId</w:t>
-            </w:r>
-            <w:proofErr w:type="spellEnd"/>
-            <w:r>
-              <w:rPr>
-                <w:sz w:val="24"/>
-                <w:szCs w:val="24"/>
-                <w:lang w:val="en-IN"/>
-              </w:rPr>
-              <w:t>=X endpoint (candidate's own applications)</w:t>
+              <w:t>Build GET /api/applications?candidateId=X endpoint (candidate's own applications)</w:t>
             </w:r>
           </w:p>
         </w:tc>
@@ -9982,25 +9271,7 @@
                 <w:szCs w:val="24"/>
                 <w:lang w:val="en-IN"/>
               </w:rPr>
-              <w:t>Build PUT /</w:t>
-            </w:r>
-            <w:proofErr w:type="spellStart"/>
-            <w:r>
-              <w:rPr>
-                <w:sz w:val="24"/>
-                <w:szCs w:val="24"/>
-                <w:lang w:val="en-IN"/>
-              </w:rPr>
-              <w:t>api</w:t>
-            </w:r>
-            <w:proofErr w:type="spellEnd"/>
-            <w:r>
-              <w:rPr>
-                <w:sz w:val="24"/>
-                <w:szCs w:val="24"/>
-                <w:lang w:val="en-IN"/>
-              </w:rPr>
-              <w:t>/applications/{id} endpoint for status update</w:t>
+              <w:t>Build PUT /api/applications/{id} endpoint for status update</w:t>
             </w:r>
           </w:p>
         </w:tc>
@@ -10464,6 +9735,7 @@
                 <w:szCs w:val="24"/>
                 <w:lang w:val="en-IN"/>
               </w:rPr>
+              <w:lastRenderedPageBreak/>
               <w:t>T5</w:t>
             </w:r>
           </w:p>
@@ -10594,7 +9866,6 @@
           <w:szCs w:val="24"/>
           <w:lang w:val="en-IN"/>
         </w:rPr>
-        <w:lastRenderedPageBreak/>
         <w:t xml:space="preserve">User Story: </w:t>
       </w:r>
       <w:r>
@@ -10643,43 +9914,7 @@
           <w:szCs w:val="24"/>
           <w:lang w:val="en-IN"/>
         </w:rPr>
-        <w:t xml:space="preserve">As a Candidate, I want to view a timeline of all status changes for each application, </w:t>
-      </w:r>
-      <w:proofErr w:type="gramStart"/>
-      <w:r>
-        <w:rPr>
-          <w:sz w:val="24"/>
-          <w:szCs w:val="24"/>
-          <w:lang w:val="en-IN"/>
-        </w:rPr>
-        <w:t>So</w:t>
-      </w:r>
-      <w:proofErr w:type="gramEnd"/>
-      <w:r>
-        <w:rPr>
-          <w:sz w:val="24"/>
-          <w:szCs w:val="24"/>
-          <w:lang w:val="en-IN"/>
-        </w:rPr>
-        <w:t xml:space="preserve"> that I can see the complete journey from application to </w:t>
-      </w:r>
-      <w:proofErr w:type="gramStart"/>
-      <w:r>
-        <w:rPr>
-          <w:sz w:val="24"/>
-          <w:szCs w:val="24"/>
-          <w:lang w:val="en-IN"/>
-        </w:rPr>
-        <w:t>final outcome</w:t>
-      </w:r>
-      <w:proofErr w:type="gramEnd"/>
-      <w:r>
-        <w:rPr>
-          <w:sz w:val="24"/>
-          <w:szCs w:val="24"/>
-          <w:lang w:val="en-IN"/>
-        </w:rPr>
-        <w:t>.</w:t>
+        <w:t>As a Candidate, I want to view a timeline of all status changes for each application, So that I can see the complete journey from application to final outcome.</w:t>
       </w:r>
       <w:r>
         <w:rPr>
@@ -10918,97 +10153,7 @@
                 <w:szCs w:val="24"/>
                 <w:lang w:val="en-IN"/>
               </w:rPr>
-              <w:t xml:space="preserve">Create </w:t>
-            </w:r>
-            <w:proofErr w:type="spellStart"/>
-            <w:r>
-              <w:rPr>
-                <w:sz w:val="24"/>
-                <w:szCs w:val="24"/>
-                <w:lang w:val="en-IN"/>
-              </w:rPr>
-              <w:t>ApplicationTimeline</w:t>
-            </w:r>
-            <w:proofErr w:type="spellEnd"/>
-            <w:r>
-              <w:rPr>
-                <w:sz w:val="24"/>
-                <w:szCs w:val="24"/>
-                <w:lang w:val="en-IN"/>
-              </w:rPr>
-              <w:t xml:space="preserve"> entity: id, </w:t>
-            </w:r>
-            <w:proofErr w:type="spellStart"/>
-            <w:r>
-              <w:rPr>
-                <w:sz w:val="24"/>
-                <w:szCs w:val="24"/>
-                <w:lang w:val="en-IN"/>
-              </w:rPr>
-              <w:t>applicationId</w:t>
-            </w:r>
-            <w:proofErr w:type="spellEnd"/>
-            <w:r>
-              <w:rPr>
-                <w:sz w:val="24"/>
-                <w:szCs w:val="24"/>
-                <w:lang w:val="en-IN"/>
-              </w:rPr>
-              <w:t xml:space="preserve">, </w:t>
-            </w:r>
-            <w:proofErr w:type="spellStart"/>
-            <w:r>
-              <w:rPr>
-                <w:sz w:val="24"/>
-                <w:szCs w:val="24"/>
-                <w:lang w:val="en-IN"/>
-              </w:rPr>
-              <w:t>fromStatus</w:t>
-            </w:r>
-            <w:proofErr w:type="spellEnd"/>
-            <w:r>
-              <w:rPr>
-                <w:sz w:val="24"/>
-                <w:szCs w:val="24"/>
-                <w:lang w:val="en-IN"/>
-              </w:rPr>
-              <w:t xml:space="preserve">, </w:t>
-            </w:r>
-            <w:proofErr w:type="spellStart"/>
-            <w:r>
-              <w:rPr>
-                <w:sz w:val="24"/>
-                <w:szCs w:val="24"/>
-                <w:lang w:val="en-IN"/>
-              </w:rPr>
-              <w:t>toStatus</w:t>
-            </w:r>
-            <w:proofErr w:type="spellEnd"/>
-            <w:r>
-              <w:rPr>
-                <w:sz w:val="24"/>
-                <w:szCs w:val="24"/>
-                <w:lang w:val="en-IN"/>
-              </w:rPr>
-              <w:t xml:space="preserve">, </w:t>
-            </w:r>
-            <w:proofErr w:type="spellStart"/>
-            <w:r>
-              <w:rPr>
-                <w:sz w:val="24"/>
-                <w:szCs w:val="24"/>
-                <w:lang w:val="en-IN"/>
-              </w:rPr>
-              <w:t>changedAt</w:t>
-            </w:r>
-            <w:proofErr w:type="spellEnd"/>
-            <w:r>
-              <w:rPr>
-                <w:sz w:val="24"/>
-                <w:szCs w:val="24"/>
-                <w:lang w:val="en-IN"/>
-              </w:rPr>
-              <w:t>, notes</w:t>
+              <w:t>Create ApplicationTimeline entity: id, applicationId, fromStatus, toStatus, changedAt, notes</w:t>
             </w:r>
           </w:p>
         </w:tc>
@@ -11210,25 +10355,7 @@
                 <w:szCs w:val="24"/>
                 <w:lang w:val="en-IN"/>
               </w:rPr>
-              <w:t>Build GET /</w:t>
-            </w:r>
-            <w:proofErr w:type="spellStart"/>
-            <w:r>
-              <w:rPr>
-                <w:sz w:val="24"/>
-                <w:szCs w:val="24"/>
-                <w:lang w:val="en-IN"/>
-              </w:rPr>
-              <w:t>api</w:t>
-            </w:r>
-            <w:proofErr w:type="spellEnd"/>
-            <w:r>
-              <w:rPr>
-                <w:sz w:val="24"/>
-                <w:szCs w:val="24"/>
-                <w:lang w:val="en-IN"/>
-              </w:rPr>
-              <w:t>/applications/{id}/timeline endpoint</w:t>
+              <w:t>Build GET /api/applications/{id}/timeline endpoint</w:t>
             </w:r>
           </w:p>
         </w:tc>
@@ -11761,6 +10888,7 @@
                 <w:szCs w:val="24"/>
                 <w:lang w:val="en-IN"/>
               </w:rPr>
+              <w:lastRenderedPageBreak/>
               <w:t>#</w:t>
             </w:r>
           </w:p>
@@ -11898,25 +11026,7 @@
                 <w:szCs w:val="24"/>
                 <w:lang w:val="en-IN"/>
               </w:rPr>
-              <w:t>Build GET /</w:t>
-            </w:r>
-            <w:proofErr w:type="spellStart"/>
-            <w:r>
-              <w:rPr>
-                <w:sz w:val="24"/>
-                <w:szCs w:val="24"/>
-                <w:lang w:val="en-IN"/>
-              </w:rPr>
-              <w:t>api</w:t>
-            </w:r>
-            <w:proofErr w:type="spellEnd"/>
-            <w:r>
-              <w:rPr>
-                <w:sz w:val="24"/>
-                <w:szCs w:val="24"/>
-                <w:lang w:val="en-IN"/>
-              </w:rPr>
-              <w:t>/applications/grouped endpoint returning count by status</w:t>
+              <w:t>Build GET /api/applications/grouped endpoint returning count by status</w:t>
             </w:r>
           </w:p>
         </w:tc>
@@ -12291,7 +11401,6 @@
           <w:szCs w:val="24"/>
           <w:lang w:val="en-IN"/>
         </w:rPr>
-        <w:lastRenderedPageBreak/>
         <w:t xml:space="preserve">FEATURE </w:t>
       </w:r>
       <w:r>
@@ -12473,25 +11582,7 @@
           <w:szCs w:val="24"/>
           <w:lang w:val="en-IN"/>
         </w:rPr>
-        <w:t xml:space="preserve">As an Interviewer, I want to schedule an interview by selecting a candidate, application, date, time, and round type, </w:t>
-      </w:r>
-      <w:proofErr w:type="gramStart"/>
-      <w:r>
-        <w:rPr>
-          <w:sz w:val="24"/>
-          <w:szCs w:val="24"/>
-          <w:lang w:val="en-IN"/>
-        </w:rPr>
-        <w:t>So</w:t>
-      </w:r>
-      <w:proofErr w:type="gramEnd"/>
-      <w:r>
-        <w:rPr>
-          <w:sz w:val="24"/>
-          <w:szCs w:val="24"/>
-          <w:lang w:val="en-IN"/>
-        </w:rPr>
-        <w:t xml:space="preserve"> that the interview is registered and the candidate is notified.</w:t>
+        <w:t>As an Interviewer, I want to schedule an interview by selecting a candidate, application, date, time, and round type, So that the interview is registered and the candidate is notified.</w:t>
       </w:r>
       <w:r>
         <w:rPr>
@@ -12735,97 +11826,7 @@
                 <w:szCs w:val="24"/>
                 <w:lang w:val="en-IN"/>
               </w:rPr>
-              <w:t xml:space="preserve">Create Interview entity: id, </w:t>
-            </w:r>
-            <w:proofErr w:type="spellStart"/>
-            <w:r>
-              <w:rPr>
-                <w:sz w:val="24"/>
-                <w:szCs w:val="24"/>
-                <w:lang w:val="en-IN"/>
-              </w:rPr>
-              <w:t>applicationId</w:t>
-            </w:r>
-            <w:proofErr w:type="spellEnd"/>
-            <w:r>
-              <w:rPr>
-                <w:sz w:val="24"/>
-                <w:szCs w:val="24"/>
-                <w:lang w:val="en-IN"/>
-              </w:rPr>
-              <w:t xml:space="preserve">, </w:t>
-            </w:r>
-            <w:proofErr w:type="spellStart"/>
-            <w:r>
-              <w:rPr>
-                <w:sz w:val="24"/>
-                <w:szCs w:val="24"/>
-                <w:lang w:val="en-IN"/>
-              </w:rPr>
-              <w:t>candidateId</w:t>
-            </w:r>
-            <w:proofErr w:type="spellEnd"/>
-            <w:r>
-              <w:rPr>
-                <w:sz w:val="24"/>
-                <w:szCs w:val="24"/>
-                <w:lang w:val="en-IN"/>
-              </w:rPr>
-              <w:t xml:space="preserve">, </w:t>
-            </w:r>
-            <w:proofErr w:type="spellStart"/>
-            <w:r>
-              <w:rPr>
-                <w:sz w:val="24"/>
-                <w:szCs w:val="24"/>
-                <w:lang w:val="en-IN"/>
-              </w:rPr>
-              <w:t>interviewerId</w:t>
-            </w:r>
-            <w:proofErr w:type="spellEnd"/>
-            <w:r>
-              <w:rPr>
-                <w:sz w:val="24"/>
-                <w:szCs w:val="24"/>
-                <w:lang w:val="en-IN"/>
-              </w:rPr>
-              <w:t xml:space="preserve">, </w:t>
-            </w:r>
-            <w:proofErr w:type="spellStart"/>
-            <w:r>
-              <w:rPr>
-                <w:sz w:val="24"/>
-                <w:szCs w:val="24"/>
-                <w:lang w:val="en-IN"/>
-              </w:rPr>
-              <w:t>roundType</w:t>
-            </w:r>
-            <w:proofErr w:type="spellEnd"/>
-            <w:r>
-              <w:rPr>
-                <w:sz w:val="24"/>
-                <w:szCs w:val="24"/>
-                <w:lang w:val="en-IN"/>
-              </w:rPr>
-              <w:t xml:space="preserve"> (TECHNICAL/BEHAVIORAL/SYSTEM_DESIGN), </w:t>
-            </w:r>
-            <w:proofErr w:type="spellStart"/>
-            <w:r>
-              <w:rPr>
-                <w:sz w:val="24"/>
-                <w:szCs w:val="24"/>
-                <w:lang w:val="en-IN"/>
-              </w:rPr>
-              <w:t>dateTime</w:t>
-            </w:r>
-            <w:proofErr w:type="spellEnd"/>
-            <w:r>
-              <w:rPr>
-                <w:sz w:val="24"/>
-                <w:szCs w:val="24"/>
-                <w:lang w:val="en-IN"/>
-              </w:rPr>
-              <w:t>, mode, status</w:t>
+              <w:t>Create Interview entity: id, applicationId, candidateId, interviewerId, roundType (TECHNICAL/BEHAVIORAL/SYSTEM_DESIGN), dateTime, mode, status</w:t>
             </w:r>
           </w:p>
         </w:tc>
@@ -12926,25 +11927,7 @@
                 <w:szCs w:val="24"/>
                 <w:lang w:val="en-IN"/>
               </w:rPr>
-              <w:t xml:space="preserve">Create </w:t>
-            </w:r>
-            <w:proofErr w:type="spellStart"/>
-            <w:r>
-              <w:rPr>
-                <w:sz w:val="24"/>
-                <w:szCs w:val="24"/>
-                <w:lang w:val="en-IN"/>
-              </w:rPr>
-              <w:t>InterviewRepository</w:t>
-            </w:r>
-            <w:proofErr w:type="spellEnd"/>
-            <w:r>
-              <w:rPr>
-                <w:sz w:val="24"/>
-                <w:szCs w:val="24"/>
-                <w:lang w:val="en-IN"/>
-              </w:rPr>
-              <w:t xml:space="preserve"> with custom queries (by candidate, by interviewer, by application, by date)</w:t>
+              <w:t>Create InterviewRepository with custom queries (by candidate, by interviewer, by application, by date)</w:t>
             </w:r>
           </w:p>
         </w:tc>
@@ -13045,25 +12028,7 @@
                 <w:szCs w:val="24"/>
                 <w:lang w:val="en-IN"/>
               </w:rPr>
-              <w:t>Build POST /</w:t>
-            </w:r>
-            <w:proofErr w:type="spellStart"/>
-            <w:r>
-              <w:rPr>
-                <w:sz w:val="24"/>
-                <w:szCs w:val="24"/>
-                <w:lang w:val="en-IN"/>
-              </w:rPr>
-              <w:t>api</w:t>
-            </w:r>
-            <w:proofErr w:type="spellEnd"/>
-            <w:r>
-              <w:rPr>
-                <w:sz w:val="24"/>
-                <w:szCs w:val="24"/>
-                <w:lang w:val="en-IN"/>
-              </w:rPr>
-              <w:t>/interviews endpoint with validation (check candidate availability)</w:t>
+              <w:t>Build POST /api/interviews endpoint with validation (check candidate availability)</w:t>
             </w:r>
           </w:p>
         </w:tc>
@@ -13164,43 +12129,7 @@
                 <w:szCs w:val="24"/>
                 <w:lang w:val="en-IN"/>
               </w:rPr>
-              <w:t>Build GET /</w:t>
-            </w:r>
-            <w:proofErr w:type="spellStart"/>
-            <w:r>
-              <w:rPr>
-                <w:sz w:val="24"/>
-                <w:szCs w:val="24"/>
-                <w:lang w:val="en-IN"/>
-              </w:rPr>
-              <w:t>api</w:t>
-            </w:r>
-            <w:proofErr w:type="spellEnd"/>
-            <w:r>
-              <w:rPr>
-                <w:sz w:val="24"/>
-                <w:szCs w:val="24"/>
-                <w:lang w:val="en-IN"/>
-              </w:rPr>
-              <w:t>/</w:t>
-            </w:r>
-            <w:proofErr w:type="spellStart"/>
-            <w:r>
-              <w:rPr>
-                <w:sz w:val="24"/>
-                <w:szCs w:val="24"/>
-                <w:lang w:val="en-IN"/>
-              </w:rPr>
-              <w:t>interviews?role</w:t>
-            </w:r>
-            <w:proofErr w:type="spellEnd"/>
-            <w:r>
-              <w:rPr>
-                <w:sz w:val="24"/>
-                <w:szCs w:val="24"/>
-                <w:lang w:val="en-IN"/>
-              </w:rPr>
-              <w:t>=INTERVIEWER endpoint (interviewer's scheduled interviews)</w:t>
+              <w:t>Build GET /api/interviews?role=INTERVIEWER endpoint (interviewer's scheduled interviews)</w:t>
             </w:r>
           </w:p>
         </w:tc>
@@ -13277,6 +12206,7 @@
                 <w:szCs w:val="24"/>
                 <w:lang w:val="en-IN"/>
               </w:rPr>
+              <w:lastRenderedPageBreak/>
               <w:t>T5</w:t>
             </w:r>
           </w:p>
@@ -13696,7 +12626,6 @@
           <w:szCs w:val="24"/>
           <w:lang w:val="en-IN"/>
         </w:rPr>
-        <w:lastRenderedPageBreak/>
         <w:br/>
       </w:r>
       <w:r>
@@ -13791,23 +12720,13 @@
         </w:rPr>
         <w:t xml:space="preserve"> </w:t>
       </w:r>
-      <w:proofErr w:type="gramStart"/>
-      <w:r>
-        <w:rPr>
-          <w:sz w:val="24"/>
-          <w:szCs w:val="24"/>
-          <w:lang w:val="en-IN"/>
-        </w:rPr>
-        <w:t>So</w:t>
-      </w:r>
-      <w:proofErr w:type="gramEnd"/>
-      <w:r>
-        <w:rPr>
-          <w:sz w:val="24"/>
-          <w:szCs w:val="24"/>
-          <w:lang w:val="en-IN"/>
-        </w:rPr>
-        <w:t xml:space="preserve"> that I can prepare accordingly and track my interview history.</w:t>
+      <w:r>
+        <w:rPr>
+          <w:sz w:val="24"/>
+          <w:szCs w:val="24"/>
+          <w:lang w:val="en-IN"/>
+        </w:rPr>
+        <w:t>So that I can prepare accordingly and track my interview history.</w:t>
       </w:r>
       <w:r>
         <w:rPr>
@@ -14058,51 +12977,15 @@
                 <w:szCs w:val="24"/>
                 <w:lang w:val="en-IN"/>
               </w:rPr>
-              <w:t>Build GET /</w:t>
-            </w:r>
-            <w:proofErr w:type="spellStart"/>
-            <w:r>
-              <w:rPr>
-                <w:sz w:val="24"/>
-                <w:szCs w:val="24"/>
-                <w:lang w:val="en-IN"/>
-              </w:rPr>
-              <w:t>api</w:t>
-            </w:r>
-            <w:proofErr w:type="spellEnd"/>
-            <w:r>
-              <w:rPr>
-                <w:sz w:val="24"/>
-                <w:szCs w:val="24"/>
-                <w:lang w:val="en-IN"/>
-              </w:rPr>
-              <w:t>/</w:t>
-            </w:r>
-            <w:proofErr w:type="spellStart"/>
-            <w:r>
-              <w:rPr>
-                <w:sz w:val="24"/>
-                <w:szCs w:val="24"/>
-                <w:lang w:val="en-IN"/>
-              </w:rPr>
-              <w:t>interviews?</w:t>
-            </w:r>
-            <w:r>
-              <w:rPr>
-                <w:sz w:val="24"/>
-                <w:szCs w:val="24"/>
-                <w:lang w:val="en-IN"/>
-              </w:rPr>
-              <w:t>candidateId</w:t>
-            </w:r>
-            <w:proofErr w:type="spellEnd"/>
-            <w:r>
-              <w:rPr>
-                <w:sz w:val="24"/>
-                <w:szCs w:val="24"/>
-                <w:lang w:val="en-IN"/>
-              </w:rPr>
-              <w:t>=X</w:t>
+              <w:t>Build GET /api/interviews?</w:t>
+            </w:r>
+            <w:r>
+              <w:rPr>
+                <w:sz w:val="24"/>
+                <w:szCs w:val="24"/>
+                <w:lang w:val="en-IN"/>
+              </w:rPr>
+              <w:t>candidateId=X</w:t>
             </w:r>
             <w:r>
               <w:rPr>
@@ -14667,23 +13550,13 @@
         </w:rPr>
         <w:t xml:space="preserve"> </w:t>
       </w:r>
-      <w:proofErr w:type="gramStart"/>
-      <w:r>
-        <w:rPr>
-          <w:sz w:val="24"/>
-          <w:szCs w:val="24"/>
-          <w:lang w:val="en-IN"/>
-        </w:rPr>
-        <w:t>So</w:t>
-      </w:r>
-      <w:proofErr w:type="gramEnd"/>
-      <w:r>
-        <w:rPr>
-          <w:sz w:val="24"/>
-          <w:szCs w:val="24"/>
-          <w:lang w:val="en-IN"/>
-        </w:rPr>
-        <w:t xml:space="preserve"> that I can manage changes in availability or interview requirements.</w:t>
+      <w:r>
+        <w:rPr>
+          <w:sz w:val="24"/>
+          <w:szCs w:val="24"/>
+          <w:lang w:val="en-IN"/>
+        </w:rPr>
+        <w:t>So that I can manage changes in availability or interview requirements.</w:t>
       </w:r>
       <w:r>
         <w:rPr>
@@ -14731,6 +13604,7 @@
           <w:szCs w:val="24"/>
           <w:lang w:val="en-IN"/>
         </w:rPr>
+        <w:lastRenderedPageBreak/>
         <w:t>T</w:t>
       </w:r>
       <w:r>
@@ -14936,25 +13810,7 @@
                 <w:szCs w:val="24"/>
                 <w:lang w:val="en-IN"/>
               </w:rPr>
-              <w:t>Build PUT /</w:t>
-            </w:r>
-            <w:proofErr w:type="spellStart"/>
-            <w:r>
-              <w:rPr>
-                <w:sz w:val="24"/>
-                <w:szCs w:val="24"/>
-                <w:lang w:val="en-IN"/>
-              </w:rPr>
-              <w:t>api</w:t>
-            </w:r>
-            <w:proofErr w:type="spellEnd"/>
-            <w:r>
-              <w:rPr>
-                <w:sz w:val="24"/>
-                <w:szCs w:val="24"/>
-                <w:lang w:val="en-IN"/>
-              </w:rPr>
-              <w:t>/interviews/{id} endpoint for update</w:t>
+              <w:t>Build PUT /api/interviews/{id} endpoint for update</w:t>
             </w:r>
           </w:p>
         </w:tc>
@@ -15055,25 +13911,7 @@
                 <w:szCs w:val="24"/>
                 <w:lang w:val="en-IN"/>
               </w:rPr>
-              <w:t>Build DELETE /</w:t>
-            </w:r>
-            <w:proofErr w:type="spellStart"/>
-            <w:r>
-              <w:rPr>
-                <w:sz w:val="24"/>
-                <w:szCs w:val="24"/>
-                <w:lang w:val="en-IN"/>
-              </w:rPr>
-              <w:t>api</w:t>
-            </w:r>
-            <w:proofErr w:type="spellEnd"/>
-            <w:r>
-              <w:rPr>
-                <w:sz w:val="24"/>
-                <w:szCs w:val="24"/>
-                <w:lang w:val="en-IN"/>
-              </w:rPr>
-              <w:t>/interviews/{id} endpoint (soft delete / status = CANCELLED)</w:t>
+              <w:t>Build DELETE /api/interviews/{id} endpoint (soft delete / status = CANCELLED)</w:t>
             </w:r>
           </w:p>
         </w:tc>
@@ -15446,7 +14284,6 @@
           <w:szCs w:val="24"/>
           <w:lang w:val="en-IN"/>
         </w:rPr>
-        <w:lastRenderedPageBreak/>
         <w:t xml:space="preserve">User Story: </w:t>
       </w:r>
       <w:r>
@@ -15753,25 +14590,7 @@
                 <w:szCs w:val="24"/>
                 <w:lang w:val="en-IN"/>
               </w:rPr>
-              <w:t>Configure Spring Boot Mail (</w:t>
-            </w:r>
-            <w:proofErr w:type="spellStart"/>
-            <w:r>
-              <w:rPr>
-                <w:sz w:val="24"/>
-                <w:szCs w:val="24"/>
-                <w:lang w:val="en-IN"/>
-              </w:rPr>
-              <w:t>JavaMailSender</w:t>
-            </w:r>
-            <w:proofErr w:type="spellEnd"/>
-            <w:r>
-              <w:rPr>
-                <w:sz w:val="24"/>
-                <w:szCs w:val="24"/>
-                <w:lang w:val="en-IN"/>
-              </w:rPr>
-              <w:t>) with SMTP</w:t>
+              <w:t>Configure Spring Boot Mail (JavaMailSender) with SMTP</w:t>
             </w:r>
           </w:p>
         </w:tc>
@@ -16074,25 +14893,7 @@
                 <w:szCs w:val="24"/>
                 <w:lang w:val="en-IN"/>
               </w:rPr>
-              <w:t xml:space="preserve">Test email delivery in staging with </w:t>
-            </w:r>
-            <w:proofErr w:type="spellStart"/>
-            <w:r>
-              <w:rPr>
-                <w:sz w:val="24"/>
-                <w:szCs w:val="24"/>
-                <w:lang w:val="en-IN"/>
-              </w:rPr>
-              <w:t>MailHog</w:t>
-            </w:r>
-            <w:proofErr w:type="spellEnd"/>
-            <w:r>
-              <w:rPr>
-                <w:sz w:val="24"/>
-                <w:szCs w:val="24"/>
-                <w:lang w:val="en-IN"/>
-              </w:rPr>
-              <w:t xml:space="preserve"> or similar</w:t>
+              <w:t>Test email delivery in staging with MailHog or similar</w:t>
             </w:r>
           </w:p>
         </w:tc>
@@ -16299,6 +15100,7 @@
           <w:szCs w:val="24"/>
           <w:lang w:val="en-IN"/>
         </w:rPr>
+        <w:lastRenderedPageBreak/>
         <w:t xml:space="preserve">User Story: </w:t>
       </w:r>
       <w:r>
@@ -16347,25 +15149,7 @@
           <w:szCs w:val="24"/>
           <w:lang w:val="en-IN"/>
         </w:rPr>
-        <w:t xml:space="preserve">As an Interviewer, I want to submit feedback after conducting an interview with scores per skill category (Technical, </w:t>
-      </w:r>
-      <w:proofErr w:type="spellStart"/>
-      <w:r>
-        <w:rPr>
-          <w:sz w:val="24"/>
-          <w:szCs w:val="24"/>
-          <w:lang w:val="en-IN"/>
-        </w:rPr>
-        <w:t>Behavioral</w:t>
-      </w:r>
-      <w:proofErr w:type="spellEnd"/>
-      <w:r>
-        <w:rPr>
-          <w:sz w:val="24"/>
-          <w:szCs w:val="24"/>
-          <w:lang w:val="en-IN"/>
-        </w:rPr>
-        <w:t>, System Design), so that the candidate receives structured, actionable evaluation.</w:t>
+        <w:t>As an Interviewer, I want to submit feedback after conducting an interview with scores per skill category (Technical, Behavioral, System Design), so that the candidate receives structured, actionable evaluation.</w:t>
       </w:r>
       <w:r>
         <w:rPr>
@@ -16608,180 +15392,8 @@
                 <w:szCs w:val="24"/>
                 <w:lang w:val="en-IN"/>
               </w:rPr>
-              <w:t xml:space="preserve">Create Feedback entity: id, </w:t>
-            </w:r>
-            <w:proofErr w:type="spellStart"/>
-            <w:r>
-              <w:rPr>
-                <w:sz w:val="24"/>
-                <w:szCs w:val="24"/>
-                <w:lang w:val="en-IN"/>
-              </w:rPr>
-              <w:t>interviewId</w:t>
-            </w:r>
-            <w:proofErr w:type="spellEnd"/>
-            <w:r>
-              <w:rPr>
-                <w:sz w:val="24"/>
-                <w:szCs w:val="24"/>
-                <w:lang w:val="en-IN"/>
-              </w:rPr>
-              <w:t xml:space="preserve">, </w:t>
-            </w:r>
-            <w:proofErr w:type="spellStart"/>
-            <w:r>
-              <w:rPr>
-                <w:sz w:val="24"/>
-                <w:szCs w:val="24"/>
-                <w:lang w:val="en-IN"/>
-              </w:rPr>
-              <w:t>roundType</w:t>
-            </w:r>
-            <w:proofErr w:type="spellEnd"/>
-            <w:r>
-              <w:rPr>
-                <w:sz w:val="24"/>
-                <w:szCs w:val="24"/>
-                <w:lang w:val="en-IN"/>
-              </w:rPr>
-              <w:t xml:space="preserve">, </w:t>
-            </w:r>
-            <w:proofErr w:type="spellStart"/>
-            <w:r>
-              <w:rPr>
-                <w:sz w:val="24"/>
-                <w:szCs w:val="24"/>
-                <w:lang w:val="en-IN"/>
-              </w:rPr>
-              <w:t>technicalScore</w:t>
-            </w:r>
-            <w:proofErr w:type="spellEnd"/>
-            <w:r>
-              <w:rPr>
-                <w:sz w:val="24"/>
-                <w:szCs w:val="24"/>
-                <w:lang w:val="en-IN"/>
-              </w:rPr>
-              <w:t xml:space="preserve">, </w:t>
-            </w:r>
-            <w:proofErr w:type="spellStart"/>
-            <w:r>
-              <w:rPr>
-                <w:sz w:val="24"/>
-                <w:szCs w:val="24"/>
-                <w:lang w:val="en-IN"/>
-              </w:rPr>
-              <w:t>behavioralScore</w:t>
-            </w:r>
-            <w:proofErr w:type="spellEnd"/>
-            <w:r>
-              <w:rPr>
-                <w:sz w:val="24"/>
-                <w:szCs w:val="24"/>
-                <w:lang w:val="en-IN"/>
-              </w:rPr>
-              <w:t xml:space="preserve">, </w:t>
-            </w:r>
-            <w:proofErr w:type="spellStart"/>
-            <w:r>
-              <w:rPr>
-                <w:sz w:val="24"/>
-                <w:szCs w:val="24"/>
-                <w:lang w:val="en-IN"/>
-              </w:rPr>
-              <w:t>systemDesignScore</w:t>
-            </w:r>
-            <w:proofErr w:type="spellEnd"/>
-            <w:r>
-              <w:rPr>
-                <w:sz w:val="24"/>
-                <w:szCs w:val="24"/>
-                <w:lang w:val="en-IN"/>
-              </w:rPr>
-              <w:t xml:space="preserve">, </w:t>
-            </w:r>
-            <w:proofErr w:type="spellStart"/>
-            <w:r>
-              <w:rPr>
-                <w:sz w:val="24"/>
-                <w:szCs w:val="24"/>
-                <w:lang w:val="en-IN"/>
-              </w:rPr>
-              <w:t>questionsAsked</w:t>
-            </w:r>
-            <w:proofErr w:type="spellEnd"/>
-            <w:r>
-              <w:rPr>
-                <w:sz w:val="24"/>
-                <w:szCs w:val="24"/>
-                <w:lang w:val="en-IN"/>
-              </w:rPr>
-              <w:t xml:space="preserve"> (JSON), </w:t>
-            </w:r>
-            <w:proofErr w:type="spellStart"/>
-            <w:r>
-              <w:rPr>
-                <w:sz w:val="24"/>
-                <w:szCs w:val="24"/>
-                <w:lang w:val="en-IN"/>
-              </w:rPr>
-              <w:t>difficultyLevel</w:t>
-            </w:r>
-            <w:proofErr w:type="spellEnd"/>
-            <w:r>
-              <w:rPr>
-                <w:sz w:val="24"/>
-                <w:szCs w:val="24"/>
-                <w:lang w:val="en-IN"/>
-              </w:rPr>
-              <w:t xml:space="preserve">, </w:t>
-            </w:r>
-            <w:proofErr w:type="spellStart"/>
-            <w:r>
-              <w:rPr>
-                <w:sz w:val="24"/>
-                <w:szCs w:val="24"/>
-                <w:lang w:val="en-IN"/>
-              </w:rPr>
-              <w:t>confidenceRating</w:t>
-            </w:r>
-            <w:proofErr w:type="spellEnd"/>
-            <w:r>
-              <w:rPr>
-                <w:sz w:val="24"/>
-                <w:szCs w:val="24"/>
-                <w:lang w:val="en-IN"/>
-              </w:rPr>
-              <w:t xml:space="preserve">, comments, </w:t>
-            </w:r>
-            <w:proofErr w:type="spellStart"/>
-            <w:r>
-              <w:rPr>
-                <w:sz w:val="24"/>
-                <w:szCs w:val="24"/>
-                <w:lang w:val="en-IN"/>
-              </w:rPr>
-              <w:t>overallScore</w:t>
-            </w:r>
-            <w:proofErr w:type="spellEnd"/>
-            <w:r>
-              <w:rPr>
-                <w:sz w:val="24"/>
-                <w:szCs w:val="24"/>
-                <w:lang w:val="en-IN"/>
-              </w:rPr>
-              <w:t xml:space="preserve">, </w:t>
-            </w:r>
-            <w:proofErr w:type="spellStart"/>
-            <w:r>
-              <w:rPr>
-                <w:sz w:val="24"/>
-                <w:szCs w:val="24"/>
-                <w:lang w:val="en-IN"/>
-              </w:rPr>
-              <w:t>submittedAt</w:t>
-            </w:r>
-            <w:proofErr w:type="spellEnd"/>
+              <w:t>Create Feedback entity: id, interviewId, roundType, technicalScore, behavioralScore, systemDesignScore, questionsAsked (JSON), difficultyLevel, confidenceRating, comments, overallScore, submittedAt</w:t>
+            </w:r>
           </w:p>
         </w:tc>
         <w:tc>
@@ -16857,7 +15469,6 @@
                 <w:szCs w:val="24"/>
                 <w:lang w:val="en-IN"/>
               </w:rPr>
-              <w:lastRenderedPageBreak/>
               <w:t>T2</w:t>
             </w:r>
           </w:p>
@@ -16882,25 +15493,7 @@
                 <w:szCs w:val="24"/>
                 <w:lang w:val="en-IN"/>
               </w:rPr>
-              <w:t>Build POST /</w:t>
-            </w:r>
-            <w:proofErr w:type="spellStart"/>
-            <w:r>
-              <w:rPr>
-                <w:sz w:val="24"/>
-                <w:szCs w:val="24"/>
-                <w:lang w:val="en-IN"/>
-              </w:rPr>
-              <w:t>api</w:t>
-            </w:r>
-            <w:proofErr w:type="spellEnd"/>
-            <w:r>
-              <w:rPr>
-                <w:sz w:val="24"/>
-                <w:szCs w:val="24"/>
-                <w:lang w:val="en-IN"/>
-              </w:rPr>
-              <w:t>/feedback endpoint</w:t>
+              <w:t>Build POST /api/feedback endpoint</w:t>
             </w:r>
           </w:p>
         </w:tc>
@@ -17001,43 +15594,7 @@
                 <w:szCs w:val="24"/>
                 <w:lang w:val="en-IN"/>
               </w:rPr>
-              <w:t>Build GET /</w:t>
-            </w:r>
-            <w:proofErr w:type="spellStart"/>
-            <w:r>
-              <w:rPr>
-                <w:sz w:val="24"/>
-                <w:szCs w:val="24"/>
-                <w:lang w:val="en-IN"/>
-              </w:rPr>
-              <w:t>api</w:t>
-            </w:r>
-            <w:proofErr w:type="spellEnd"/>
-            <w:r>
-              <w:rPr>
-                <w:sz w:val="24"/>
-                <w:szCs w:val="24"/>
-                <w:lang w:val="en-IN"/>
-              </w:rPr>
-              <w:t>/feedback/{</w:t>
-            </w:r>
-            <w:proofErr w:type="spellStart"/>
-            <w:r>
-              <w:rPr>
-                <w:sz w:val="24"/>
-                <w:szCs w:val="24"/>
-                <w:lang w:val="en-IN"/>
-              </w:rPr>
-              <w:t>interviewId</w:t>
-            </w:r>
-            <w:proofErr w:type="spellEnd"/>
-            <w:r>
-              <w:rPr>
-                <w:sz w:val="24"/>
-                <w:szCs w:val="24"/>
-                <w:lang w:val="en-IN"/>
-              </w:rPr>
-              <w:t>} endpoint</w:t>
+              <w:t>Build GET /api/feedback/{interviewId} endpoint</w:t>
             </w:r>
           </w:p>
         </w:tc>
@@ -17239,18 +15796,8 @@
                 <w:szCs w:val="24"/>
                 <w:lang w:val="en-IN"/>
               </w:rPr>
-              <w:t xml:space="preserve">Create Feedback submission form UI with skill sliders, difficulty dropdown, confidence rating, and questions asked </w:t>
-            </w:r>
-            <w:proofErr w:type="spellStart"/>
-            <w:r>
-              <w:rPr>
-                <w:sz w:val="24"/>
-                <w:szCs w:val="24"/>
-                <w:lang w:val="en-IN"/>
-              </w:rPr>
-              <w:t>textarea</w:t>
-            </w:r>
-            <w:proofErr w:type="spellEnd"/>
+              <w:t>Create Feedback submission form UI with skill sliders, difficulty dropdown, confidence rating, and questions asked textarea</w:t>
+            </w:r>
           </w:p>
         </w:tc>
         <w:tc>
@@ -17350,25 +15897,7 @@
                 <w:szCs w:val="24"/>
                 <w:lang w:val="en-IN"/>
               </w:rPr>
-              <w:t>Calculate overall score automatically (</w:t>
-            </w:r>
-            <w:proofErr w:type="spellStart"/>
-            <w:r>
-              <w:rPr>
-                <w:sz w:val="24"/>
-                <w:szCs w:val="24"/>
-                <w:lang w:val="en-IN"/>
-              </w:rPr>
-              <w:t>avg</w:t>
-            </w:r>
-            <w:proofErr w:type="spellEnd"/>
-            <w:r>
-              <w:rPr>
-                <w:sz w:val="24"/>
-                <w:szCs w:val="24"/>
-                <w:lang w:val="en-IN"/>
-              </w:rPr>
-              <w:t xml:space="preserve"> of skill scores)</w:t>
+              <w:t>Calculate overall score automatically (avg of skill scores)</w:t>
             </w:r>
           </w:p>
         </w:tc>
@@ -17642,27 +16171,15 @@
         </w:rPr>
         <w:t xml:space="preserve"> </w:t>
       </w:r>
-      <w:proofErr w:type="gramStart"/>
-      <w:r>
-        <w:rPr>
-          <w:b/>
-          <w:bCs/>
-          <w:sz w:val="24"/>
-          <w:szCs w:val="24"/>
-          <w:lang w:val="en-IN"/>
-        </w:rPr>
-        <w:t>So</w:t>
-      </w:r>
-      <w:proofErr w:type="gramEnd"/>
-      <w:r>
-        <w:rPr>
-          <w:b/>
-          <w:bCs/>
-          <w:sz w:val="24"/>
-          <w:szCs w:val="24"/>
-          <w:lang w:val="en-IN"/>
-        </w:rPr>
-        <w:t xml:space="preserve"> that</w:t>
+      <w:r>
+        <w:rPr>
+          <w:b/>
+          <w:bCs/>
+          <w:sz w:val="24"/>
+          <w:szCs w:val="24"/>
+          <w:lang w:val="en-IN"/>
+        </w:rPr>
+        <w:t>So that</w:t>
       </w:r>
       <w:r>
         <w:rPr>
@@ -17909,43 +16426,7 @@
                 <w:szCs w:val="24"/>
                 <w:lang w:val="en-IN"/>
               </w:rPr>
-              <w:t>Build GET /</w:t>
-            </w:r>
-            <w:proofErr w:type="spellStart"/>
-            <w:r>
-              <w:rPr>
-                <w:sz w:val="24"/>
-                <w:szCs w:val="24"/>
-                <w:lang w:val="en-IN"/>
-              </w:rPr>
-              <w:t>api</w:t>
-            </w:r>
-            <w:proofErr w:type="spellEnd"/>
-            <w:r>
-              <w:rPr>
-                <w:sz w:val="24"/>
-                <w:szCs w:val="24"/>
-                <w:lang w:val="en-IN"/>
-              </w:rPr>
-              <w:t>/feedback/candidate/{</w:t>
-            </w:r>
-            <w:proofErr w:type="spellStart"/>
-            <w:r>
-              <w:rPr>
-                <w:sz w:val="24"/>
-                <w:szCs w:val="24"/>
-                <w:lang w:val="en-IN"/>
-              </w:rPr>
-              <w:t>candidateId</w:t>
-            </w:r>
-            <w:proofErr w:type="spellEnd"/>
-            <w:r>
-              <w:rPr>
-                <w:sz w:val="24"/>
-                <w:szCs w:val="24"/>
-                <w:lang w:val="en-IN"/>
-              </w:rPr>
-              <w:t>} (all feedback for candidate across all applications)</w:t>
+              <w:t>Build GET /api/feedback/candidate/{candidateId} (all feedback for candidate across all applications)</w:t>
             </w:r>
           </w:p>
         </w:tc>
@@ -18022,6 +16503,7 @@
                 <w:szCs w:val="24"/>
                 <w:lang w:val="en-IN"/>
               </w:rPr>
+              <w:lastRenderedPageBreak/>
               <w:t>T2</w:t>
             </w:r>
           </w:p>
@@ -18046,25 +16528,7 @@
                 <w:szCs w:val="24"/>
                 <w:lang w:val="en-IN"/>
               </w:rPr>
-              <w:t xml:space="preserve">Create Feedback detail page with skill progress bars per round (Technical, </w:t>
-            </w:r>
-            <w:proofErr w:type="spellStart"/>
-            <w:r>
-              <w:rPr>
-                <w:sz w:val="24"/>
-                <w:szCs w:val="24"/>
-                <w:lang w:val="en-IN"/>
-              </w:rPr>
-              <w:t>Behavioral</w:t>
-            </w:r>
-            <w:proofErr w:type="spellEnd"/>
-            <w:r>
-              <w:rPr>
-                <w:sz w:val="24"/>
-                <w:szCs w:val="24"/>
-                <w:lang w:val="en-IN"/>
-              </w:rPr>
-              <w:t>, System Design)</w:t>
+              <w:t>Create Feedback detail page with skill progress bars per round (Technical, Behavioral, System Design)</w:t>
             </w:r>
           </w:p>
         </w:tc>
@@ -18454,7 +16918,6 @@
           <w:szCs w:val="24"/>
           <w:lang w:val="en-IN"/>
         </w:rPr>
-        <w:lastRenderedPageBreak/>
         <w:br/>
       </w:r>
       <w:r>
@@ -18668,25 +17131,7 @@
           <w:szCs w:val="24"/>
           <w:lang w:val="en-IN"/>
         </w:rPr>
-        <w:t xml:space="preserve">As a Candidate, I want to see a dashboard showing my weak areas (e.g., DSA, System Design) based on feedback scores, </w:t>
-      </w:r>
-      <w:proofErr w:type="gramStart"/>
-      <w:r>
-        <w:rPr>
-          <w:sz w:val="24"/>
-          <w:szCs w:val="24"/>
-          <w:lang w:val="en-IN"/>
-        </w:rPr>
-        <w:t>So</w:t>
-      </w:r>
-      <w:proofErr w:type="gramEnd"/>
-      <w:r>
-        <w:rPr>
-          <w:sz w:val="24"/>
-          <w:szCs w:val="24"/>
-          <w:lang w:val="en-IN"/>
-        </w:rPr>
-        <w:t xml:space="preserve"> that I can focus my preparation on areas that need improvement.</w:t>
+        <w:t>As a Candidate, I want to see a dashboard showing my weak areas (e.g., DSA, System Design) based on feedback scores, So that I can focus my preparation on areas that need improvement.</w:t>
       </w:r>
       <w:r>
         <w:rPr>
@@ -18928,71 +17373,7 @@
                 <w:szCs w:val="24"/>
                 <w:lang w:val="en-IN"/>
               </w:rPr>
-              <w:t>Build GET /</w:t>
-            </w:r>
-            <w:proofErr w:type="spellStart"/>
-            <w:r>
-              <w:rPr>
-                <w:sz w:val="24"/>
-                <w:szCs w:val="24"/>
-                <w:lang w:val="en-IN"/>
-              </w:rPr>
-              <w:t>api</w:t>
-            </w:r>
-            <w:proofErr w:type="spellEnd"/>
-            <w:r>
-              <w:rPr>
-                <w:sz w:val="24"/>
-                <w:szCs w:val="24"/>
-                <w:lang w:val="en-IN"/>
-              </w:rPr>
-              <w:t>/analytics/</w:t>
-            </w:r>
-            <w:proofErr w:type="spellStart"/>
-            <w:proofErr w:type="gramStart"/>
-            <w:r>
-              <w:rPr>
-                <w:sz w:val="24"/>
-                <w:szCs w:val="24"/>
-                <w:lang w:val="en-IN"/>
-              </w:rPr>
-              <w:t>weak-areas</w:t>
-            </w:r>
-            <w:proofErr w:type="gramEnd"/>
-            <w:r>
-              <w:rPr>
-                <w:sz w:val="24"/>
-                <w:szCs w:val="24"/>
-                <w:lang w:val="en-IN"/>
-              </w:rPr>
-              <w:t>?candidateId</w:t>
-            </w:r>
-            <w:proofErr w:type="spellEnd"/>
-            <w:r>
-              <w:rPr>
-                <w:sz w:val="24"/>
-                <w:szCs w:val="24"/>
-                <w:lang w:val="en-IN"/>
-              </w:rPr>
-              <w:t>=X endpoint (</w:t>
-            </w:r>
-            <w:proofErr w:type="spellStart"/>
-            <w:r>
-              <w:rPr>
-                <w:sz w:val="24"/>
-                <w:szCs w:val="24"/>
-                <w:lang w:val="en-IN"/>
-              </w:rPr>
-              <w:t>avg</w:t>
-            </w:r>
-            <w:proofErr w:type="spellEnd"/>
-            <w:r>
-              <w:rPr>
-                <w:sz w:val="24"/>
-                <w:szCs w:val="24"/>
-                <w:lang w:val="en-IN"/>
-              </w:rPr>
-              <w:t xml:space="preserve"> scores per skill category)</w:t>
+              <w:t>Build GET /api/analytics/weak-areas?candidateId=X endpoint (avg scores per skill category)</w:t>
             </w:r>
           </w:p>
         </w:tc>
@@ -19093,25 +17474,7 @@
                 <w:szCs w:val="24"/>
                 <w:lang w:val="en-IN"/>
               </w:rPr>
-              <w:t xml:space="preserve">Calculate weak areas: skill with </w:t>
-            </w:r>
-            <w:proofErr w:type="spellStart"/>
-            <w:r>
-              <w:rPr>
-                <w:sz w:val="24"/>
-                <w:szCs w:val="24"/>
-                <w:lang w:val="en-IN"/>
-              </w:rPr>
-              <w:t>avg</w:t>
-            </w:r>
-            <w:proofErr w:type="spellEnd"/>
-            <w:r>
-              <w:rPr>
-                <w:sz w:val="24"/>
-                <w:szCs w:val="24"/>
-                <w:lang w:val="en-IN"/>
-              </w:rPr>
-              <w:t xml:space="preserve"> score &lt; 70%</w:t>
+              <w:t>Calculate weak areas: skill with avg score &lt; 70%</w:t>
             </w:r>
           </w:p>
         </w:tc>
@@ -19212,25 +17575,7 @@
                 <w:szCs w:val="24"/>
                 <w:lang w:val="en-IN"/>
               </w:rPr>
-              <w:t xml:space="preserve">Candidate dashboard UI: stat cards (Total Applications, Interviews Completed, </w:t>
-            </w:r>
-            <w:proofErr w:type="spellStart"/>
-            <w:r>
-              <w:rPr>
-                <w:sz w:val="24"/>
-                <w:szCs w:val="24"/>
-                <w:lang w:val="en-IN"/>
-              </w:rPr>
-              <w:t>Avg</w:t>
-            </w:r>
-            <w:proofErr w:type="spellEnd"/>
-            <w:r>
-              <w:rPr>
-                <w:sz w:val="24"/>
-                <w:szCs w:val="24"/>
-                <w:lang w:val="en-IN"/>
-              </w:rPr>
-              <w:t xml:space="preserve"> Score)</w:t>
+              <w:t>Candidate dashboard UI: stat cards (Total Applications, Interviews Completed, Avg Score)</w:t>
             </w:r>
           </w:p>
         </w:tc>
@@ -19307,6 +17652,7 @@
                 <w:szCs w:val="24"/>
                 <w:lang w:val="en-IN"/>
               </w:rPr>
+              <w:lastRenderedPageBreak/>
               <w:t>T4</w:t>
             </w:r>
           </w:p>
@@ -19669,7 +18015,6 @@
                 <w:szCs w:val="24"/>
                 <w:lang w:val="en-IN"/>
               </w:rPr>
-              <w:lastRenderedPageBreak/>
               <w:t>#</w:t>
             </w:r>
           </w:p>
@@ -19807,43 +18152,7 @@
                 <w:szCs w:val="24"/>
                 <w:lang w:val="en-IN"/>
               </w:rPr>
-              <w:t>Build GET /</w:t>
-            </w:r>
-            <w:proofErr w:type="spellStart"/>
-            <w:r>
-              <w:rPr>
-                <w:sz w:val="24"/>
-                <w:szCs w:val="24"/>
-                <w:lang w:val="en-IN"/>
-              </w:rPr>
-              <w:t>api</w:t>
-            </w:r>
-            <w:proofErr w:type="spellEnd"/>
-            <w:r>
-              <w:rPr>
-                <w:sz w:val="24"/>
-                <w:szCs w:val="24"/>
-                <w:lang w:val="en-IN"/>
-              </w:rPr>
-              <w:t>/analytics/</w:t>
-            </w:r>
-            <w:proofErr w:type="spellStart"/>
-            <w:r>
-              <w:rPr>
-                <w:sz w:val="24"/>
-                <w:szCs w:val="24"/>
-                <w:lang w:val="en-IN"/>
-              </w:rPr>
-              <w:t>success-rate?candidateId</w:t>
-            </w:r>
-            <w:proofErr w:type="spellEnd"/>
-            <w:r>
-              <w:rPr>
-                <w:sz w:val="24"/>
-                <w:szCs w:val="24"/>
-                <w:lang w:val="en-IN"/>
-              </w:rPr>
-              <w:t>=X endpoint (count OFFER vs total applications)</w:t>
+              <w:t>Build GET /api/analytics/success-rate?candidateId=X endpoint (count OFFER vs total applications)</w:t>
             </w:r>
           </w:p>
         </w:tc>
@@ -20510,43 +18819,7 @@
                 <w:szCs w:val="24"/>
                 <w:lang w:val="en-IN"/>
               </w:rPr>
-              <w:t>Build GET /</w:t>
-            </w:r>
-            <w:proofErr w:type="spellStart"/>
-            <w:r>
-              <w:rPr>
-                <w:sz w:val="24"/>
-                <w:szCs w:val="24"/>
-                <w:lang w:val="en-IN"/>
-              </w:rPr>
-              <w:t>api</w:t>
-            </w:r>
-            <w:proofErr w:type="spellEnd"/>
-            <w:r>
-              <w:rPr>
-                <w:sz w:val="24"/>
-                <w:szCs w:val="24"/>
-                <w:lang w:val="en-IN"/>
-              </w:rPr>
-              <w:t>/analytics/</w:t>
-            </w:r>
-            <w:proofErr w:type="spellStart"/>
-            <w:r>
-              <w:rPr>
-                <w:sz w:val="24"/>
-                <w:szCs w:val="24"/>
-                <w:lang w:val="en-IN"/>
-              </w:rPr>
-              <w:t>rejection-stage?candidateId</w:t>
-            </w:r>
-            <w:proofErr w:type="spellEnd"/>
-            <w:r>
-              <w:rPr>
-                <w:sz w:val="24"/>
-                <w:szCs w:val="24"/>
-                <w:lang w:val="en-IN"/>
-              </w:rPr>
-              <w:t>=X endpoint (group rejections by round type)</w:t>
+              <w:t>Build GET /api/analytics/rejection-stage?candidateId=X endpoint (group rejections by round type)</w:t>
             </w:r>
           </w:p>
         </w:tc>
@@ -20724,6 +18997,7 @@
                 <w:szCs w:val="24"/>
                 <w:lang w:val="en-IN"/>
               </w:rPr>
+              <w:lastRenderedPageBreak/>
               <w:t>T3</w:t>
             </w:r>
           </w:p>
@@ -21081,7 +19355,6 @@
                 <w:szCs w:val="24"/>
                 <w:lang w:val="en-IN"/>
               </w:rPr>
-              <w:lastRenderedPageBreak/>
               <w:t>#</w:t>
             </w:r>
           </w:p>
@@ -21219,79 +19492,7 @@
                 <w:szCs w:val="24"/>
                 <w:lang w:val="en-IN"/>
               </w:rPr>
-              <w:t>Build GET /</w:t>
-            </w:r>
-            <w:proofErr w:type="spellStart"/>
-            <w:r>
-              <w:rPr>
-                <w:sz w:val="24"/>
-                <w:szCs w:val="24"/>
-                <w:lang w:val="en-IN"/>
-              </w:rPr>
-              <w:t>api</w:t>
-            </w:r>
-            <w:proofErr w:type="spellEnd"/>
-            <w:r>
-              <w:rPr>
-                <w:sz w:val="24"/>
-                <w:szCs w:val="24"/>
-                <w:lang w:val="en-IN"/>
-              </w:rPr>
-              <w:t>/analytics/</w:t>
-            </w:r>
-            <w:proofErr w:type="spellStart"/>
-            <w:r>
-              <w:rPr>
-                <w:sz w:val="24"/>
-                <w:szCs w:val="24"/>
-                <w:lang w:val="en-IN"/>
-              </w:rPr>
-              <w:t>trends?candidateId</w:t>
-            </w:r>
-            <w:proofErr w:type="spellEnd"/>
-            <w:r>
-              <w:rPr>
-                <w:sz w:val="24"/>
-                <w:szCs w:val="24"/>
-                <w:lang w:val="en-IN"/>
-              </w:rPr>
-              <w:t>=</w:t>
-            </w:r>
-            <w:proofErr w:type="spellStart"/>
-            <w:r>
-              <w:rPr>
-                <w:sz w:val="24"/>
-                <w:szCs w:val="24"/>
-                <w:lang w:val="en-IN"/>
-              </w:rPr>
-              <w:t>X&amp;months</w:t>
-            </w:r>
-            <w:proofErr w:type="spellEnd"/>
-            <w:r>
-              <w:rPr>
-                <w:sz w:val="24"/>
-                <w:szCs w:val="24"/>
-                <w:lang w:val="en-IN"/>
-              </w:rPr>
-              <w:t xml:space="preserve">=6 endpoint (monthly </w:t>
-            </w:r>
-            <w:proofErr w:type="spellStart"/>
-            <w:r>
-              <w:rPr>
-                <w:sz w:val="24"/>
-                <w:szCs w:val="24"/>
-                <w:lang w:val="en-IN"/>
-              </w:rPr>
-              <w:t>avg</w:t>
-            </w:r>
-            <w:proofErr w:type="spellEnd"/>
-            <w:r>
-              <w:rPr>
-                <w:sz w:val="24"/>
-                <w:szCs w:val="24"/>
-                <w:lang w:val="en-IN"/>
-              </w:rPr>
-              <w:t xml:space="preserve"> scores)</w:t>
+              <w:t>Build GET /api/analytics/trends?candidateId=X&amp;months=6 endpoint (monthly avg scores)</w:t>
             </w:r>
           </w:p>
         </w:tc>
@@ -21986,6 +20187,7 @@
                 <w:szCs w:val="24"/>
                 <w:lang w:val="en-IN"/>
               </w:rPr>
+              <w:lastRenderedPageBreak/>
               <w:t>#</w:t>
             </w:r>
           </w:p>
@@ -22123,36 +20325,8 @@
                 <w:szCs w:val="24"/>
                 <w:lang w:val="en-IN"/>
               </w:rPr>
-              <w:t xml:space="preserve">Create Recommendation entity: id, </w:t>
-            </w:r>
-            <w:proofErr w:type="spellStart"/>
-            <w:r>
-              <w:rPr>
-                <w:sz w:val="24"/>
-                <w:szCs w:val="24"/>
-                <w:lang w:val="en-IN"/>
-              </w:rPr>
-              <w:t>candidateId</w:t>
-            </w:r>
-            <w:proofErr w:type="spellEnd"/>
-            <w:r>
-              <w:rPr>
-                <w:sz w:val="24"/>
-                <w:szCs w:val="24"/>
-                <w:lang w:val="en-IN"/>
-              </w:rPr>
-              <w:t xml:space="preserve">, category (DSA/SYSTEM_DESIGN/BEHAVIORAL), message, priority, </w:t>
-            </w:r>
-            <w:proofErr w:type="spellStart"/>
-            <w:r>
-              <w:rPr>
-                <w:sz w:val="24"/>
-                <w:szCs w:val="24"/>
-                <w:lang w:val="en-IN"/>
-              </w:rPr>
-              <w:t>createdAt</w:t>
-            </w:r>
-            <w:proofErr w:type="spellEnd"/>
+              <w:t>Create Recommendation entity: id, candidateId, category (DSA/SYSTEM_DESIGN/BEHAVIORAL), message, priority, createdAt</w:t>
+            </w:r>
           </w:p>
         </w:tc>
         <w:tc>
@@ -22279,25 +20453,7 @@
                 <w:lang w:val="en-IN"/>
               </w:rPr>
               <w:br/>
-              <w:t xml:space="preserve">- If </w:t>
-            </w:r>
-            <w:proofErr w:type="spellStart"/>
-            <w:r>
-              <w:rPr>
-                <w:sz w:val="24"/>
-                <w:szCs w:val="24"/>
-                <w:lang w:val="en-IN"/>
-              </w:rPr>
-              <w:t>Behavioral</w:t>
-            </w:r>
-            <w:proofErr w:type="spellEnd"/>
-            <w:r>
-              <w:rPr>
-                <w:sz w:val="24"/>
-                <w:szCs w:val="24"/>
-                <w:lang w:val="en-IN"/>
-              </w:rPr>
-              <w:t xml:space="preserve"> score &lt; 65% → "Improve Communication"</w:t>
+              <w:t>- If Behavioral score &lt; 65% → "Improve Communication"</w:t>
             </w:r>
           </w:p>
         </w:tc>
@@ -22398,43 +20554,7 @@
                 <w:szCs w:val="24"/>
                 <w:lang w:val="en-IN"/>
               </w:rPr>
-              <w:t>Build GET /</w:t>
-            </w:r>
-            <w:proofErr w:type="spellStart"/>
-            <w:r>
-              <w:rPr>
-                <w:sz w:val="24"/>
-                <w:szCs w:val="24"/>
-                <w:lang w:val="en-IN"/>
-              </w:rPr>
-              <w:t>api</w:t>
-            </w:r>
-            <w:proofErr w:type="spellEnd"/>
-            <w:r>
-              <w:rPr>
-                <w:sz w:val="24"/>
-                <w:szCs w:val="24"/>
-                <w:lang w:val="en-IN"/>
-              </w:rPr>
-              <w:t>/</w:t>
-            </w:r>
-            <w:proofErr w:type="spellStart"/>
-            <w:r>
-              <w:rPr>
-                <w:sz w:val="24"/>
-                <w:szCs w:val="24"/>
-                <w:lang w:val="en-IN"/>
-              </w:rPr>
-              <w:t>recommendations?candidateId</w:t>
-            </w:r>
-            <w:proofErr w:type="spellEnd"/>
-            <w:r>
-              <w:rPr>
-                <w:sz w:val="24"/>
-                <w:szCs w:val="24"/>
-                <w:lang w:val="en-IN"/>
-              </w:rPr>
-              <w:t>=X endpoint</w:t>
+              <w:t>Build GET /api/recommendations?candidateId=X endpoint</w:t>
             </w:r>
           </w:p>
         </w:tc>
@@ -22713,7 +20833,6 @@
                 <w:szCs w:val="24"/>
                 <w:lang w:val="en-IN"/>
               </w:rPr>
-              <w:lastRenderedPageBreak/>
               <w:t>T6</w:t>
             </w:r>
           </w:p>
@@ -22738,25 +20857,7 @@
                 <w:szCs w:val="24"/>
                 <w:lang w:val="en-IN"/>
               </w:rPr>
-              <w:t xml:space="preserve">Show priority-based </w:t>
-            </w:r>
-            <w:proofErr w:type="spellStart"/>
-            <w:r>
-              <w:rPr>
-                <w:sz w:val="24"/>
-                <w:szCs w:val="24"/>
-                <w:lang w:val="en-IN"/>
-              </w:rPr>
-              <w:t>color</w:t>
-            </w:r>
-            <w:proofErr w:type="spellEnd"/>
-            <w:r>
-              <w:rPr>
-                <w:sz w:val="24"/>
-                <w:szCs w:val="24"/>
-                <w:lang w:val="en-IN"/>
-              </w:rPr>
-              <w:t xml:space="preserve"> coding (High: Red, Medium: Yellow, Low: Blue)</w:t>
+              <w:t>Show priority-based color coding (High: Red, Medium: Yellow, Low: Blue)</w:t>
             </w:r>
           </w:p>
         </w:tc>
@@ -22983,25 +21084,7 @@
           <w:szCs w:val="24"/>
           <w:lang w:val="en-IN"/>
         </w:rPr>
-        <w:t xml:space="preserve">As a Candidate, I want to dismiss recommendations once I've addressed them, </w:t>
-      </w:r>
-      <w:proofErr w:type="gramStart"/>
-      <w:r>
-        <w:rPr>
-          <w:sz w:val="24"/>
-          <w:szCs w:val="24"/>
-          <w:lang w:val="en-IN"/>
-        </w:rPr>
-        <w:t>So</w:t>
-      </w:r>
-      <w:proofErr w:type="gramEnd"/>
-      <w:r>
-        <w:rPr>
-          <w:sz w:val="24"/>
-          <w:szCs w:val="24"/>
-          <w:lang w:val="en-IN"/>
-        </w:rPr>
-        <w:t xml:space="preserve"> that my dashboard only shows relevant, actionable items.</w:t>
+        <w:t>As a Candidate, I want to dismiss recommendations once I've addressed them, So that my dashboard only shows relevant, actionable items.</w:t>
       </w:r>
       <w:r>
         <w:rPr>
@@ -23240,25 +21323,7 @@
                 <w:szCs w:val="24"/>
                 <w:lang w:val="en-IN"/>
               </w:rPr>
-              <w:t xml:space="preserve">Add dismissed </w:t>
-            </w:r>
-            <w:proofErr w:type="spellStart"/>
-            <w:r>
-              <w:rPr>
-                <w:sz w:val="24"/>
-                <w:szCs w:val="24"/>
-                <w:lang w:val="en-IN"/>
-              </w:rPr>
-              <w:t>boolean</w:t>
-            </w:r>
-            <w:proofErr w:type="spellEnd"/>
-            <w:r>
-              <w:rPr>
-                <w:sz w:val="24"/>
-                <w:szCs w:val="24"/>
-                <w:lang w:val="en-IN"/>
-              </w:rPr>
-              <w:t xml:space="preserve"> field to Recommendation entity</w:t>
+              <w:t>Add dismissed boolean field to Recommendation entity</w:t>
             </w:r>
           </w:p>
         </w:tc>
@@ -23359,25 +21424,7 @@
                 <w:szCs w:val="24"/>
                 <w:lang w:val="en-IN"/>
               </w:rPr>
-              <w:t>Build PUT /</w:t>
-            </w:r>
-            <w:proofErr w:type="spellStart"/>
-            <w:r>
-              <w:rPr>
-                <w:sz w:val="24"/>
-                <w:szCs w:val="24"/>
-                <w:lang w:val="en-IN"/>
-              </w:rPr>
-              <w:t>api</w:t>
-            </w:r>
-            <w:proofErr w:type="spellEnd"/>
-            <w:r>
-              <w:rPr>
-                <w:sz w:val="24"/>
-                <w:szCs w:val="24"/>
-                <w:lang w:val="en-IN"/>
-              </w:rPr>
-              <w:t>/recommendations/{id}/dismiss endpoint</w:t>
+              <w:t>Build PUT /api/recommendations/{id}/dismiss endpoint</w:t>
             </w:r>
           </w:p>
         </w:tc>
@@ -23767,6 +21814,7 @@
           <w:szCs w:val="24"/>
           <w:lang w:val="en-IN"/>
         </w:rPr>
+        <w:lastRenderedPageBreak/>
         <w:t xml:space="preserve">FEATURE </w:t>
       </w:r>
       <w:r>
@@ -24006,27 +22054,15 @@
         </w:rPr>
         <w:br/>
       </w:r>
-      <w:proofErr w:type="spellStart"/>
-      <w:r>
-        <w:rPr>
-          <w:b/>
-          <w:bCs/>
-          <w:sz w:val="24"/>
-          <w:szCs w:val="24"/>
-          <w:lang w:val="en-IN"/>
-        </w:rPr>
-        <w:t>Estimaton</w:t>
-      </w:r>
-      <w:proofErr w:type="spellEnd"/>
-      <w:r>
-        <w:rPr>
-          <w:b/>
-          <w:bCs/>
-          <w:sz w:val="24"/>
-          <w:szCs w:val="24"/>
-          <w:lang w:val="en-IN"/>
-        </w:rPr>
-        <w:t>:</w:t>
+      <w:r>
+        <w:rPr>
+          <w:b/>
+          <w:bCs/>
+          <w:sz w:val="24"/>
+          <w:szCs w:val="24"/>
+          <w:lang w:val="en-IN"/>
+        </w:rPr>
+        <w:t>Estimaton:</w:t>
       </w:r>
       <w:r>
         <w:rPr>
@@ -24110,7 +22146,6 @@
                 <w:szCs w:val="24"/>
                 <w:lang w:val="en-IN"/>
               </w:rPr>
-              <w:lastRenderedPageBreak/>
               <w:t>#</w:t>
             </w:r>
           </w:p>
@@ -24248,43 +22283,7 @@
                 <w:szCs w:val="24"/>
                 <w:lang w:val="en-IN"/>
               </w:rPr>
-              <w:t>Build GET /</w:t>
-            </w:r>
-            <w:proofErr w:type="spellStart"/>
-            <w:r>
-              <w:rPr>
-                <w:sz w:val="24"/>
-                <w:szCs w:val="24"/>
-                <w:lang w:val="en-IN"/>
-              </w:rPr>
-              <w:t>api</w:t>
-            </w:r>
-            <w:proofErr w:type="spellEnd"/>
-            <w:r>
-              <w:rPr>
-                <w:sz w:val="24"/>
-                <w:szCs w:val="24"/>
-                <w:lang w:val="en-IN"/>
-              </w:rPr>
-              <w:t>/admin/</w:t>
-            </w:r>
-            <w:proofErr w:type="gramStart"/>
-            <w:r>
-              <w:rPr>
-                <w:sz w:val="24"/>
-                <w:szCs w:val="24"/>
-                <w:lang w:val="en-IN"/>
-              </w:rPr>
-              <w:t>users</w:t>
-            </w:r>
-            <w:proofErr w:type="gramEnd"/>
-            <w:r>
-              <w:rPr>
-                <w:sz w:val="24"/>
-                <w:szCs w:val="24"/>
-                <w:lang w:val="en-IN"/>
-              </w:rPr>
-              <w:t xml:space="preserve"> endpoint with pagination and role filter</w:t>
+              <w:t>Build GET /api/admin/users endpoint with pagination and role filter</w:t>
             </w:r>
           </w:p>
         </w:tc>
@@ -24688,25 +22687,7 @@
                 <w:szCs w:val="24"/>
                 <w:lang w:val="en-IN"/>
               </w:rPr>
-              <w:t>Build PUT /</w:t>
-            </w:r>
-            <w:proofErr w:type="spellStart"/>
-            <w:r>
-              <w:rPr>
-                <w:sz w:val="24"/>
-                <w:szCs w:val="24"/>
-                <w:lang w:val="en-IN"/>
-              </w:rPr>
-              <w:t>api</w:t>
-            </w:r>
-            <w:proofErr w:type="spellEnd"/>
-            <w:r>
-              <w:rPr>
-                <w:sz w:val="24"/>
-                <w:szCs w:val="24"/>
-                <w:lang w:val="en-IN"/>
-              </w:rPr>
-              <w:t>/admin/users/{id}/deactivate endpoint</w:t>
+              <w:t>Build PUT /api/admin/users/{id}/deactivate endpoint</w:t>
             </w:r>
           </w:p>
         </w:tc>
@@ -24934,43 +22915,7 @@
           <w:szCs w:val="24"/>
           <w:lang w:val="en-IN"/>
         </w:rPr>
-        <w:t xml:space="preserve">As an Admin, I want to view all applications across all candidates with their </w:t>
-      </w:r>
-      <w:proofErr w:type="gramStart"/>
-      <w:r>
-        <w:rPr>
-          <w:sz w:val="24"/>
-          <w:szCs w:val="24"/>
-          <w:lang w:val="en-IN"/>
-        </w:rPr>
-        <w:t>current status</w:t>
-      </w:r>
-      <w:proofErr w:type="gramEnd"/>
-      <w:r>
-        <w:rPr>
-          <w:sz w:val="24"/>
-          <w:szCs w:val="24"/>
-          <w:lang w:val="en-IN"/>
-        </w:rPr>
-        <w:t xml:space="preserve">, </w:t>
-      </w:r>
-      <w:proofErr w:type="gramStart"/>
-      <w:r>
-        <w:rPr>
-          <w:sz w:val="24"/>
-          <w:szCs w:val="24"/>
-          <w:lang w:val="en-IN"/>
-        </w:rPr>
-        <w:t>So</w:t>
-      </w:r>
-      <w:proofErr w:type="gramEnd"/>
-      <w:r>
-        <w:rPr>
-          <w:sz w:val="24"/>
-          <w:szCs w:val="24"/>
-          <w:lang w:val="en-IN"/>
-        </w:rPr>
-        <w:t xml:space="preserve"> that I can monitor platform-wide application activity.</w:t>
+        <w:t>As an Admin, I want to view all applications across all candidates with their current status, So that I can monitor platform-wide application activity.</w:t>
       </w:r>
       <w:r>
         <w:rPr>
@@ -25209,25 +23154,7 @@
                 <w:szCs w:val="24"/>
                 <w:lang w:val="en-IN"/>
               </w:rPr>
-              <w:t>Build GET /</w:t>
-            </w:r>
-            <w:proofErr w:type="spellStart"/>
-            <w:r>
-              <w:rPr>
-                <w:sz w:val="24"/>
-                <w:szCs w:val="24"/>
-                <w:lang w:val="en-IN"/>
-              </w:rPr>
-              <w:t>api</w:t>
-            </w:r>
-            <w:proofErr w:type="spellEnd"/>
-            <w:r>
-              <w:rPr>
-                <w:sz w:val="24"/>
-                <w:szCs w:val="24"/>
-                <w:lang w:val="en-IN"/>
-              </w:rPr>
-              <w:t>/admin/applications endpoint (all applications with candidate info)</w:t>
+              <w:t>Build GET /api/admin/applications endpoint (all applications with candidate info)</w:t>
             </w:r>
           </w:p>
         </w:tc>
@@ -25405,6 +23332,7 @@
                 <w:szCs w:val="24"/>
                 <w:lang w:val="en-IN"/>
               </w:rPr>
+              <w:lastRenderedPageBreak/>
               <w:t>T3</w:t>
             </w:r>
           </w:p>
@@ -25659,25 +23587,7 @@
           <w:szCs w:val="24"/>
           <w:lang w:val="en-IN"/>
         </w:rPr>
-        <w:t xml:space="preserve">As an Admin, I want to view platform-wide analytics (total applications, success rate, </w:t>
-      </w:r>
-      <w:proofErr w:type="spellStart"/>
-      <w:r>
-        <w:rPr>
-          <w:sz w:val="24"/>
-          <w:szCs w:val="24"/>
-          <w:lang w:val="en-IN"/>
-        </w:rPr>
-        <w:t>avg</w:t>
-      </w:r>
-      <w:proofErr w:type="spellEnd"/>
-      <w:r>
-        <w:rPr>
-          <w:sz w:val="24"/>
-          <w:szCs w:val="24"/>
-          <w:lang w:val="en-IN"/>
-        </w:rPr>
-        <w:t xml:space="preserve"> scores, top rejection reasons), So that I can generate insights and reports for stakeholders.</w:t>
+        <w:t>As an Admin, I want to view platform-wide analytics (total applications, success rate, avg scores, top rejection reasons), So that I can generate insights and reports for stakeholders.</w:t>
       </w:r>
     </w:p>
     <w:p>
@@ -25725,7 +23635,6 @@
           <w:szCs w:val="24"/>
           <w:lang w:val="en-IN"/>
         </w:rPr>
-        <w:lastRenderedPageBreak/>
         <w:t>Ta</w:t>
       </w:r>
       <w:r>
@@ -25931,43 +23840,7 @@
                 <w:szCs w:val="24"/>
                 <w:lang w:val="en-IN"/>
               </w:rPr>
-              <w:t>Build GET /</w:t>
-            </w:r>
-            <w:proofErr w:type="spellStart"/>
-            <w:r>
-              <w:rPr>
-                <w:sz w:val="24"/>
-                <w:szCs w:val="24"/>
-                <w:lang w:val="en-IN"/>
-              </w:rPr>
-              <w:t>api</w:t>
-            </w:r>
-            <w:proofErr w:type="spellEnd"/>
-            <w:r>
-              <w:rPr>
-                <w:sz w:val="24"/>
-                <w:szCs w:val="24"/>
-                <w:lang w:val="en-IN"/>
-              </w:rPr>
-              <w:t xml:space="preserve">/admin/analytics/overview endpoint (total users, applications, interviews, </w:t>
-            </w:r>
-            <w:proofErr w:type="spellStart"/>
-            <w:r>
-              <w:rPr>
-                <w:sz w:val="24"/>
-                <w:szCs w:val="24"/>
-                <w:lang w:val="en-IN"/>
-              </w:rPr>
-              <w:t>avg</w:t>
-            </w:r>
-            <w:proofErr w:type="spellEnd"/>
-            <w:r>
-              <w:rPr>
-                <w:sz w:val="24"/>
-                <w:szCs w:val="24"/>
-                <w:lang w:val="en-IN"/>
-              </w:rPr>
-              <w:t xml:space="preserve"> success rate)</w:t>
+              <w:t>Build GET /api/admin/analytics/overview endpoint (total users, applications, interviews, avg success rate)</w:t>
             </w:r>
           </w:p>
         </w:tc>
@@ -26068,25 +23941,7 @@
                 <w:szCs w:val="24"/>
                 <w:lang w:val="en-IN"/>
               </w:rPr>
-              <w:t>Build GET /</w:t>
-            </w:r>
-            <w:proofErr w:type="spellStart"/>
-            <w:r>
-              <w:rPr>
-                <w:sz w:val="24"/>
-                <w:szCs w:val="24"/>
-                <w:lang w:val="en-IN"/>
-              </w:rPr>
-              <w:t>api</w:t>
-            </w:r>
-            <w:proofErr w:type="spellEnd"/>
-            <w:r>
-              <w:rPr>
-                <w:sz w:val="24"/>
-                <w:szCs w:val="24"/>
-                <w:lang w:val="en-IN"/>
-              </w:rPr>
-              <w:t>/admin/analytics/top-rejections endpoint (group by round type and count)</w:t>
+              <w:t>Build GET /api/admin/analytics/top-rejections endpoint (group by round type and count)</w:t>
             </w:r>
           </w:p>
         </w:tc>
@@ -26968,6 +24823,7 @@
                 <w:szCs w:val="24"/>
                 <w:lang w:val="en-IN"/>
               </w:rPr>
+              <w:lastRenderedPageBreak/>
               <w:t>Interview Scheduling</w:t>
             </w:r>
           </w:p>

</xml_diff>